<commit_message>
docs-sync: gitops.md → Documents/gitops.docx
Co-Authored-By: Claude Sonnet 4.6 <noreply@anthropic.com>
</commit_message>
<xml_diff>
--- a/Documents/gitops.docx
+++ b/Documents/gitops.docx
@@ -28,7 +28,7 @@
         </w:p>
       </w:sdtContent>
     </w:sdt>
-    <w:bookmarkStart w:id="33" w:name="gitops-운영-런북--argocd-app-of-apps"/>
+    <w:bookmarkStart w:id="42" w:name="gitops-운영-런북--argocd-app-of-apps"/>
     <w:p>
       <w:pPr>
         <w:pStyle w:val="Heading1"/>
@@ -2965,7 +2965,2482 @@
       </w:r>
     </w:p>
     <w:bookmarkEnd w:id="31"/>
-    <w:bookmarkStart w:id="32" w:name="변경-이력"/>
+    <w:bookmarkStart w:id="40" w:name="X4568beee37175af94b5dd2e5549e7680fbe07ee"/>
+    <w:p>
+      <w:pPr>
+        <w:pStyle w:val="Heading2"/>
+      </w:pPr>
+      <w:r>
+        <w:t xml:space="preserve">9. 드리프트 해소 로그 (Step 3 — 2026-04-23)</w:t>
+      </w:r>
+    </w:p>
+    <w:p>
+      <w:pPr>
+        <w:pStyle w:val="FirstParagraph"/>
+      </w:pPr>
+      <w:r>
+        <w:rPr>
+          <w:b/>
+          <w:bCs/>
+        </w:rPr>
+        <w:t xml:space="preserve">실행 일시</w:t>
+      </w:r>
+      <w:r>
+        <w:t xml:space="preserve">: 2026-04-23</w:t>
+      </w:r>
+      <w:r>
+        <w:br/>
+      </w:r>
+      <w:r>
+        <w:rPr>
+          <w:b/>
+          <w:bCs/>
+        </w:rPr>
+        <w:t xml:space="preserve">결과</w:t>
+      </w:r>
+      <w:r>
+        <w:t xml:space="preserve">: 21개 Application Synced/Healthy, 7개 이월</w:t>
+      </w:r>
+    </w:p>
+    <w:bookmarkStart w:id="32" w:name="처리-결과-요약"/>
+    <w:p>
+      <w:pPr>
+        <w:pStyle w:val="Heading3"/>
+      </w:pPr>
+      <w:r>
+        <w:t xml:space="preserve">처리 결과 요약</w:t>
+      </w:r>
+    </w:p>
+    <w:tbl>
+      <w:tblPr>
+        <w:tblStyle w:val="Table"/>
+        <w:tblW w:type="auto" w:w="0"/>
+        <w:tblLook w:firstRow="1" w:lastRow="0" w:firstColumn="0" w:lastColumn="0" w:noHBand="0" w:noVBand="0" w:val="0020"/>
+      </w:tblPr>
+      <w:tblGrid>
+        <w:gridCol w:w="1980"/>
+        <w:gridCol w:w="1980"/>
+        <w:gridCol w:w="1980"/>
+        <w:gridCol w:w="1980"/>
+      </w:tblGrid>
+      <w:tr>
+        <w:trPr>
+          <w:tblHeader w:val="on"/>
+        </w:trPr>
+        <w:tc>
+          <w:tcPr/>
+          <w:p>
+            <w:pPr>
+              <w:pStyle w:val="Compact"/>
+            </w:pPr>
+            <w:r>
+              <w:t xml:space="preserve">번호</w:t>
+            </w:r>
+          </w:p>
+        </w:tc>
+        <w:tc>
+          <w:tcPr/>
+          <w:p>
+            <w:pPr>
+              <w:pStyle w:val="Compact"/>
+            </w:pPr>
+            <w:r>
+              <w:t xml:space="preserve">Application</w:t>
+            </w:r>
+          </w:p>
+        </w:tc>
+        <w:tc>
+          <w:tcPr/>
+          <w:p>
+            <w:pPr>
+              <w:pStyle w:val="Compact"/>
+            </w:pPr>
+            <w:r>
+              <w:t xml:space="preserve">결과</w:t>
+            </w:r>
+          </w:p>
+        </w:tc>
+        <w:tc>
+          <w:tcPr/>
+          <w:p>
+            <w:pPr>
+              <w:pStyle w:val="Compact"/>
+            </w:pPr>
+            <w:r>
+              <w:t xml:space="preserve">비고</w:t>
+            </w:r>
+          </w:p>
+        </w:tc>
+      </w:tr>
+      <w:tr>
+        <w:tc>
+          <w:tcPr/>
+          <w:p>
+            <w:pPr>
+              <w:pStyle w:val="Compact"/>
+            </w:pPr>
+            <w:r>
+              <w:t xml:space="preserve">1</w:t>
+            </w:r>
+          </w:p>
+        </w:tc>
+        <w:tc>
+          <w:tcPr/>
+          <w:p>
+            <w:pPr>
+              <w:pStyle w:val="Compact"/>
+            </w:pPr>
+            <w:r>
+              <w:rPr>
+                <w:rStyle w:val="VerbatimChar"/>
+              </w:rPr>
+              <w:t xml:space="preserve">ocr-cert-manager</w:t>
+            </w:r>
+          </w:p>
+        </w:tc>
+        <w:tc>
+          <w:tcPr/>
+          <w:p>
+            <w:pPr>
+              <w:pStyle w:val="Compact"/>
+            </w:pPr>
+            <w:r>
+              <w:rPr>
+                <w:b/>
+                <w:bCs/>
+              </w:rPr>
+              <w:t xml:space="preserve">Synced/Healthy</w:t>
+            </w:r>
+          </w:p>
+        </w:tc>
+        <w:tc>
+          <w:tcPr/>
+          <w:p>
+            <w:pPr>
+              <w:pStyle w:val="Compact"/>
+            </w:pPr>
+            <w:r>
+              <w:t xml:space="preserve">caBundle ignoreDifferences 적용됨</w:t>
+            </w:r>
+          </w:p>
+        </w:tc>
+      </w:tr>
+      <w:tr>
+        <w:tc>
+          <w:tcPr/>
+          <w:p>
+            <w:pPr>
+              <w:pStyle w:val="Compact"/>
+            </w:pPr>
+            <w:r>
+              <w:t xml:space="preserve">2</w:t>
+            </w:r>
+          </w:p>
+        </w:tc>
+        <w:tc>
+          <w:tcPr/>
+          <w:p>
+            <w:pPr>
+              <w:pStyle w:val="Compact"/>
+            </w:pPr>
+            <w:r>
+              <w:rPr>
+                <w:rStyle w:val="VerbatimChar"/>
+              </w:rPr>
+              <w:t xml:space="preserve">ocr-cnpg</w:t>
+            </w:r>
+          </w:p>
+        </w:tc>
+        <w:tc>
+          <w:tcPr/>
+          <w:p>
+            <w:pPr>
+              <w:pStyle w:val="Compact"/>
+            </w:pPr>
+            <w:r>
+              <w:rPr>
+                <w:b/>
+                <w:bCs/>
+              </w:rPr>
+              <w:t xml:space="preserve">Synced/Healthy</w:t>
+            </w:r>
+          </w:p>
+        </w:tc>
+        <w:tc>
+          <w:tcPr/>
+          <w:p>
+            <w:pPr>
+              <w:pStyle w:val="Compact"/>
+            </w:pPr>
+            <w:r>
+              <w:t xml:space="preserve">CRD annotation too large (cosmetic) — SSA로 처리</w:t>
+            </w:r>
+          </w:p>
+        </w:tc>
+      </w:tr>
+      <w:tr>
+        <w:tc>
+          <w:tcPr/>
+          <w:p>
+            <w:pPr>
+              <w:pStyle w:val="Compact"/>
+            </w:pPr>
+            <w:r>
+              <w:t xml:space="preserve">3</w:t>
+            </w:r>
+          </w:p>
+        </w:tc>
+        <w:tc>
+          <w:tcPr/>
+          <w:p>
+            <w:pPr>
+              <w:pStyle w:val="Compact"/>
+            </w:pPr>
+            <w:r>
+              <w:rPr>
+                <w:rStyle w:val="VerbatimChar"/>
+              </w:rPr>
+              <w:t xml:space="preserve">ocr-cilium</w:t>
+            </w:r>
+          </w:p>
+        </w:tc>
+        <w:tc>
+          <w:tcPr/>
+          <w:p>
+            <w:pPr>
+              <w:pStyle w:val="Compact"/>
+            </w:pPr>
+            <w:r>
+              <w:rPr>
+                <w:b/>
+                <w:bCs/>
+              </w:rPr>
+              <w:t xml:space="preserve">Synced/Healthy</w:t>
+            </w:r>
+          </w:p>
+        </w:tc>
+        <w:tc>
+          <w:tcPr/>
+          <w:p>
+            <w:pPr>
+              <w:pStyle w:val="Compact"/>
+            </w:pPr>
+            <w:r>
+              <w:t xml:space="preserve">-</w:t>
+            </w:r>
+          </w:p>
+        </w:tc>
+      </w:tr>
+      <w:tr>
+        <w:tc>
+          <w:tcPr/>
+          <w:p>
+            <w:pPr>
+              <w:pStyle w:val="Compact"/>
+            </w:pPr>
+            <w:r>
+              <w:t xml:space="preserve">4</w:t>
+            </w:r>
+          </w:p>
+        </w:tc>
+        <w:tc>
+          <w:tcPr/>
+          <w:p>
+            <w:pPr>
+              <w:pStyle w:val="Compact"/>
+            </w:pPr>
+            <w:r>
+              <w:rPr>
+                <w:rStyle w:val="VerbatimChar"/>
+              </w:rPr>
+              <w:t xml:space="preserve">ocr-external-secrets</w:t>
+            </w:r>
+          </w:p>
+        </w:tc>
+        <w:tc>
+          <w:tcPr/>
+          <w:p>
+            <w:pPr>
+              <w:pStyle w:val="Compact"/>
+            </w:pPr>
+            <w:r>
+              <w:rPr>
+                <w:b/>
+                <w:bCs/>
+              </w:rPr>
+              <w:t xml:space="preserve">Synced/Healthy</w:t>
+            </w:r>
+          </w:p>
+        </w:tc>
+        <w:tc>
+          <w:tcPr/>
+          <w:p>
+            <w:pPr>
+              <w:pStyle w:val="Compact"/>
+            </w:pPr>
+            <w:r>
+              <w:t xml:space="preserve">CRD annotation too large (cosmetic)</w:t>
+            </w:r>
+          </w:p>
+        </w:tc>
+      </w:tr>
+      <w:tr>
+        <w:tc>
+          <w:tcPr/>
+          <w:p>
+            <w:pPr>
+              <w:pStyle w:val="Compact"/>
+            </w:pPr>
+            <w:r>
+              <w:t xml:space="preserve">5</w:t>
+            </w:r>
+          </w:p>
+        </w:tc>
+        <w:tc>
+          <w:tcPr/>
+          <w:p>
+            <w:pPr>
+              <w:pStyle w:val="Compact"/>
+            </w:pPr>
+            <w:r>
+              <w:rPr>
+                <w:rStyle w:val="VerbatimChar"/>
+              </w:rPr>
+              <w:t xml:space="preserve">ocr-openbao</w:t>
+            </w:r>
+          </w:p>
+        </w:tc>
+        <w:tc>
+          <w:tcPr/>
+          <w:p>
+            <w:pPr>
+              <w:pStyle w:val="Compact"/>
+            </w:pPr>
+            <w:r>
+              <w:rPr>
+                <w:b/>
+                <w:bCs/>
+              </w:rPr>
+              <w:t xml:space="preserve">Synced/Healthy</w:t>
+            </w:r>
+          </w:p>
+        </w:tc>
+        <w:tc>
+          <w:tcPr/>
+          <w:p>
+            <w:pPr>
+              <w:pStyle w:val="Compact"/>
+            </w:pPr>
+            <w:r>
+              <w:t xml:space="preserve">-</w:t>
+            </w:r>
+          </w:p>
+        </w:tc>
+      </w:tr>
+      <w:tr>
+        <w:tc>
+          <w:tcPr/>
+          <w:p>
+            <w:pPr>
+              <w:pStyle w:val="Compact"/>
+            </w:pPr>
+            <w:r>
+              <w:t xml:space="preserve">6</w:t>
+            </w:r>
+          </w:p>
+        </w:tc>
+        <w:tc>
+          <w:tcPr/>
+          <w:p>
+            <w:pPr>
+              <w:pStyle w:val="Compact"/>
+            </w:pPr>
+            <w:r>
+              <w:rPr>
+                <w:rStyle w:val="VerbatimChar"/>
+              </w:rPr>
+              <w:t xml:space="preserve">ocr-fluentbit</w:t>
+            </w:r>
+          </w:p>
+        </w:tc>
+        <w:tc>
+          <w:tcPr/>
+          <w:p>
+            <w:pPr>
+              <w:pStyle w:val="Compact"/>
+            </w:pPr>
+            <w:r>
+              <w:rPr>
+                <w:b/>
+                <w:bCs/>
+              </w:rPr>
+              <w:t xml:space="preserve">Synced/Healthy</w:t>
+            </w:r>
+          </w:p>
+        </w:tc>
+        <w:tc>
+          <w:tcPr/>
+          <w:p>
+            <w:pPr>
+              <w:pStyle w:val="Compact"/>
+            </w:pPr>
+            <w:r>
+              <w:t xml:space="preserve">-</w:t>
+            </w:r>
+          </w:p>
+        </w:tc>
+      </w:tr>
+      <w:tr>
+        <w:tc>
+          <w:tcPr/>
+          <w:p>
+            <w:pPr>
+              <w:pStyle w:val="Compact"/>
+            </w:pPr>
+            <w:r>
+              <w:t xml:space="preserve">7</w:t>
+            </w:r>
+          </w:p>
+        </w:tc>
+        <w:tc>
+          <w:tcPr/>
+          <w:p>
+            <w:pPr>
+              <w:pStyle w:val="Compact"/>
+            </w:pPr>
+            <w:r>
+              <w:rPr>
+                <w:rStyle w:val="VerbatimChar"/>
+              </w:rPr>
+              <w:t xml:space="preserve">ocr-kps</w:t>
+            </w:r>
+          </w:p>
+        </w:tc>
+        <w:tc>
+          <w:tcPr/>
+          <w:p>
+            <w:pPr>
+              <w:pStyle w:val="Compact"/>
+            </w:pPr>
+            <w:r>
+              <w:rPr>
+                <w:b/>
+                <w:bCs/>
+              </w:rPr>
+              <w:t xml:space="preserve">Synced/Healthy</w:t>
+            </w:r>
+          </w:p>
+        </w:tc>
+        <w:tc>
+          <w:tcPr/>
+          <w:p>
+            <w:pPr>
+              <w:pStyle w:val="Compact"/>
+            </w:pPr>
+            <w:r>
+              <w:t xml:space="preserve">kps-admission-create Job hook 완료 후 operation null 처리</w:t>
+            </w:r>
+          </w:p>
+        </w:tc>
+      </w:tr>
+      <w:tr>
+        <w:tc>
+          <w:tcPr/>
+          <w:p>
+            <w:pPr>
+              <w:pStyle w:val="Compact"/>
+            </w:pPr>
+            <w:r>
+              <w:t xml:space="preserve">8</w:t>
+            </w:r>
+          </w:p>
+        </w:tc>
+        <w:tc>
+          <w:tcPr/>
+          <w:p>
+            <w:pPr>
+              <w:pStyle w:val="Compact"/>
+            </w:pPr>
+            <w:r>
+              <w:rPr>
+                <w:rStyle w:val="VerbatimChar"/>
+              </w:rPr>
+              <w:t xml:space="preserve">ocr-opensearch</w:t>
+            </w:r>
+          </w:p>
+        </w:tc>
+        <w:tc>
+          <w:tcPr/>
+          <w:p>
+            <w:pPr>
+              <w:pStyle w:val="Compact"/>
+            </w:pPr>
+            <w:r>
+              <w:rPr>
+                <w:b/>
+                <w:bCs/>
+              </w:rPr>
+              <w:t xml:space="preserve">Synced/Healthy</w:t>
+            </w:r>
+          </w:p>
+        </w:tc>
+        <w:tc>
+          <w:tcPr/>
+          <w:p>
+            <w:pPr>
+              <w:pStyle w:val="Compact"/>
+            </w:pPr>
+            <w:r>
+              <w:t xml:space="preserve">-</w:t>
+            </w:r>
+          </w:p>
+        </w:tc>
+      </w:tr>
+      <w:tr>
+        <w:tc>
+          <w:tcPr/>
+          <w:p>
+            <w:pPr>
+              <w:pStyle w:val="Compact"/>
+            </w:pPr>
+            <w:r>
+              <w:t xml:space="preserve">9</w:t>
+            </w:r>
+          </w:p>
+        </w:tc>
+        <w:tc>
+          <w:tcPr/>
+          <w:p>
+            <w:pPr>
+              <w:pStyle w:val="Compact"/>
+            </w:pPr>
+            <w:r>
+              <w:rPr>
+                <w:rStyle w:val="VerbatimChar"/>
+              </w:rPr>
+              <w:t xml:space="preserve">ocr-seaweedfs</w:t>
+            </w:r>
+          </w:p>
+        </w:tc>
+        <w:tc>
+          <w:tcPr/>
+          <w:p>
+            <w:pPr>
+              <w:pStyle w:val="Compact"/>
+            </w:pPr>
+            <w:r>
+              <w:rPr>
+                <w:b/>
+                <w:bCs/>
+              </w:rPr>
+              <w:t xml:space="preserve">Synced/Healthy</w:t>
+            </w:r>
+          </w:p>
+        </w:tc>
+        <w:tc>
+          <w:tcPr/>
+          <w:p>
+            <w:pPr>
+              <w:pStyle w:val="Compact"/>
+            </w:pPr>
+            <w:r>
+              <w:t xml:space="preserve">-</w:t>
+            </w:r>
+          </w:p>
+        </w:tc>
+      </w:tr>
+      <w:tr>
+        <w:tc>
+          <w:tcPr/>
+          <w:p>
+            <w:pPr>
+              <w:pStyle w:val="Compact"/>
+            </w:pPr>
+            <w:r>
+              <w:t xml:space="preserve">10</w:t>
+            </w:r>
+          </w:p>
+        </w:tc>
+        <w:tc>
+          <w:tcPr/>
+          <w:p>
+            <w:pPr>
+              <w:pStyle w:val="Compact"/>
+            </w:pPr>
+            <w:r>
+              <w:rPr>
+                <w:rStyle w:val="VerbatimChar"/>
+              </w:rPr>
+              <w:t xml:space="preserve">ocr-keycloak</w:t>
+            </w:r>
+          </w:p>
+        </w:tc>
+        <w:tc>
+          <w:tcPr/>
+          <w:p>
+            <w:pPr>
+              <w:pStyle w:val="Compact"/>
+            </w:pPr>
+            <w:r>
+              <w:rPr>
+                <w:b/>
+                <w:bCs/>
+              </w:rPr>
+              <w:t xml:space="preserve">Synced/Healthy</w:t>
+            </w:r>
+          </w:p>
+        </w:tc>
+        <w:tc>
+          <w:tcPr/>
+          <w:p>
+            <w:pPr>
+              <w:pStyle w:val="Compact"/>
+            </w:pPr>
+            <w:r>
+              <w:t xml:space="preserve">-</w:t>
+            </w:r>
+          </w:p>
+        </w:tc>
+      </w:tr>
+      <w:tr>
+        <w:tc>
+          <w:tcPr/>
+          <w:p>
+            <w:pPr>
+              <w:pStyle w:val="Compact"/>
+            </w:pPr>
+            <w:r>
+              <w:t xml:space="preserve">11</w:t>
+            </w:r>
+          </w:p>
+        </w:tc>
+        <w:tc>
+          <w:tcPr/>
+          <w:p>
+            <w:pPr>
+              <w:pStyle w:val="Compact"/>
+            </w:pPr>
+            <w:r>
+              <w:rPr>
+                <w:rStyle w:val="VerbatimChar"/>
+              </w:rPr>
+              <w:t xml:space="preserve">manifests-cert-manager</w:t>
+            </w:r>
+          </w:p>
+        </w:tc>
+        <w:tc>
+          <w:tcPr/>
+          <w:p>
+            <w:pPr>
+              <w:pStyle w:val="Compact"/>
+            </w:pPr>
+            <w:r>
+              <w:rPr>
+                <w:b/>
+                <w:bCs/>
+              </w:rPr>
+              <w:t xml:space="preserve">Synced/Healthy</w:t>
+            </w:r>
+          </w:p>
+        </w:tc>
+        <w:tc>
+          <w:tcPr/>
+          <w:p>
+            <w:pPr>
+              <w:pStyle w:val="Compact"/>
+            </w:pPr>
+            <w:r>
+              <w:t xml:space="preserve">-</w:t>
+            </w:r>
+          </w:p>
+        </w:tc>
+      </w:tr>
+      <w:tr>
+        <w:tc>
+          <w:tcPr/>
+          <w:p>
+            <w:pPr>
+              <w:pStyle w:val="Compact"/>
+            </w:pPr>
+            <w:r>
+              <w:t xml:space="preserve">12</w:t>
+            </w:r>
+          </w:p>
+        </w:tc>
+        <w:tc>
+          <w:tcPr/>
+          <w:p>
+            <w:pPr>
+              <w:pStyle w:val="Compact"/>
+            </w:pPr>
+            <w:r>
+              <w:rPr>
+                <w:rStyle w:val="VerbatimChar"/>
+              </w:rPr>
+              <w:t xml:space="preserve">manifests-cilium</w:t>
+            </w:r>
+          </w:p>
+        </w:tc>
+        <w:tc>
+          <w:tcPr/>
+          <w:p>
+            <w:pPr>
+              <w:pStyle w:val="Compact"/>
+            </w:pPr>
+            <w:r>
+              <w:rPr>
+                <w:b/>
+                <w:bCs/>
+              </w:rPr>
+              <w:t xml:space="preserve">Synced/Healthy</w:t>
+            </w:r>
+          </w:p>
+        </w:tc>
+        <w:tc>
+          <w:tcPr/>
+          <w:p>
+            <w:pPr>
+              <w:pStyle w:val="Compact"/>
+            </w:pPr>
+            <w:r>
+              <w:t xml:space="preserve">-</w:t>
+            </w:r>
+          </w:p>
+        </w:tc>
+      </w:tr>
+      <w:tr>
+        <w:tc>
+          <w:tcPr/>
+          <w:p>
+            <w:pPr>
+              <w:pStyle w:val="Compact"/>
+            </w:pPr>
+            <w:r>
+              <w:t xml:space="preserve">13</w:t>
+            </w:r>
+          </w:p>
+        </w:tc>
+        <w:tc>
+          <w:tcPr/>
+          <w:p>
+            <w:pPr>
+              <w:pStyle w:val="Compact"/>
+            </w:pPr>
+            <w:r>
+              <w:rPr>
+                <w:rStyle w:val="VerbatimChar"/>
+              </w:rPr>
+              <w:t xml:space="preserve">manifests-external-secrets</w:t>
+            </w:r>
+          </w:p>
+        </w:tc>
+        <w:tc>
+          <w:tcPr/>
+          <w:p>
+            <w:pPr>
+              <w:pStyle w:val="Compact"/>
+            </w:pPr>
+            <w:r>
+              <w:rPr>
+                <w:b/>
+                <w:bCs/>
+              </w:rPr>
+              <w:t xml:space="preserve">OutOfSync (허용)</w:t>
+            </w:r>
+          </w:p>
+        </w:tc>
+        <w:tc>
+          <w:tcPr/>
+          <w:p>
+            <w:pPr>
+              <w:pStyle w:val="Compact"/>
+            </w:pPr>
+            <w:r>
+              <w:t xml:space="preserve">ExternalSecret ESO spec defaulting — ignoreDifferences 추가됨</w:t>
+            </w:r>
+          </w:p>
+        </w:tc>
+      </w:tr>
+      <w:tr>
+        <w:tc>
+          <w:tcPr/>
+          <w:p>
+            <w:pPr>
+              <w:pStyle w:val="Compact"/>
+            </w:pPr>
+            <w:r>
+              <w:t xml:space="preserve">14</w:t>
+            </w:r>
+          </w:p>
+        </w:tc>
+        <w:tc>
+          <w:tcPr/>
+          <w:p>
+            <w:pPr>
+              <w:pStyle w:val="Compact"/>
+            </w:pPr>
+            <w:r>
+              <w:rPr>
+                <w:rStyle w:val="VerbatimChar"/>
+              </w:rPr>
+              <w:t xml:space="preserve">manifests-openbao</w:t>
+            </w:r>
+          </w:p>
+        </w:tc>
+        <w:tc>
+          <w:tcPr/>
+          <w:p>
+            <w:pPr>
+              <w:pStyle w:val="Compact"/>
+            </w:pPr>
+            <w:r>
+              <w:rPr>
+                <w:b/>
+                <w:bCs/>
+              </w:rPr>
+              <w:t xml:space="preserve">Synced/Healthy</w:t>
+            </w:r>
+          </w:p>
+        </w:tc>
+        <w:tc>
+          <w:tcPr/>
+          <w:p>
+            <w:pPr>
+              <w:pStyle w:val="Compact"/>
+            </w:pPr>
+            <w:r>
+              <w:t xml:space="preserve">-</w:t>
+            </w:r>
+          </w:p>
+        </w:tc>
+      </w:tr>
+      <w:tr>
+        <w:tc>
+          <w:tcPr/>
+          <w:p>
+            <w:pPr>
+              <w:pStyle w:val="Compact"/>
+            </w:pPr>
+            <w:r>
+              <w:t xml:space="preserve">15</w:t>
+            </w:r>
+          </w:p>
+        </w:tc>
+        <w:tc>
+          <w:tcPr/>
+          <w:p>
+            <w:pPr>
+              <w:pStyle w:val="Compact"/>
+            </w:pPr>
+            <w:r>
+              <w:rPr>
+                <w:rStyle w:val="VerbatimChar"/>
+              </w:rPr>
+              <w:t xml:space="preserve">manifests-keycloak</w:t>
+            </w:r>
+          </w:p>
+        </w:tc>
+        <w:tc>
+          <w:tcPr/>
+          <w:p>
+            <w:pPr>
+              <w:pStyle w:val="Compact"/>
+            </w:pPr>
+            <w:r>
+              <w:rPr>
+                <w:b/>
+                <w:bCs/>
+              </w:rPr>
+              <w:t xml:space="preserve">이월</w:t>
+            </w:r>
+          </w:p>
+        </w:tc>
+        <w:tc>
+          <w:tcPr/>
+          <w:p>
+            <w:pPr>
+              <w:pStyle w:val="Compact"/>
+            </w:pPr>
+            <w:r>
+              <w:t xml:space="preserve">realm-ocr.json → infra/keycloak-realm/로 이동, 재배포 필요</w:t>
+            </w:r>
+          </w:p>
+        </w:tc>
+      </w:tr>
+      <w:tr>
+        <w:tc>
+          <w:tcPr/>
+          <w:p>
+            <w:pPr>
+              <w:pStyle w:val="Compact"/>
+            </w:pPr>
+            <w:r>
+              <w:t xml:space="preserve">16</w:t>
+            </w:r>
+          </w:p>
+        </w:tc>
+        <w:tc>
+          <w:tcPr/>
+          <w:p>
+            <w:pPr>
+              <w:pStyle w:val="Compact"/>
+            </w:pPr>
+            <w:r>
+              <w:rPr>
+                <w:rStyle w:val="VerbatimChar"/>
+              </w:rPr>
+              <w:t xml:space="preserve">manifests-upload-api</w:t>
+            </w:r>
+          </w:p>
+        </w:tc>
+        <w:tc>
+          <w:tcPr/>
+          <w:p>
+            <w:pPr>
+              <w:pStyle w:val="Compact"/>
+            </w:pPr>
+            <w:r>
+              <w:rPr>
+                <w:b/>
+                <w:bCs/>
+              </w:rPr>
+              <w:t xml:space="preserve">Synced/Healthy</w:t>
+            </w:r>
+          </w:p>
+        </w:tc>
+        <w:tc>
+          <w:tcPr/>
+          <w:p>
+            <w:pPr>
+              <w:pStyle w:val="Compact"/>
+            </w:pPr>
+            <w:r>
+              <w:t xml:space="preserve">ArgoCD ownership label 소급 추가 후 sync</w:t>
+            </w:r>
+          </w:p>
+        </w:tc>
+      </w:tr>
+      <w:tr>
+        <w:tc>
+          <w:tcPr/>
+          <w:p>
+            <w:pPr>
+              <w:pStyle w:val="Compact"/>
+            </w:pPr>
+            <w:r>
+              <w:t xml:space="preserve">17</w:t>
+            </w:r>
+          </w:p>
+        </w:tc>
+        <w:tc>
+          <w:tcPr/>
+          <w:p>
+            <w:pPr>
+              <w:pStyle w:val="Compact"/>
+            </w:pPr>
+            <w:r>
+              <w:rPr>
+                <w:rStyle w:val="VerbatimChar"/>
+              </w:rPr>
+              <w:t xml:space="preserve">manifests-fpe-service</w:t>
+            </w:r>
+          </w:p>
+        </w:tc>
+        <w:tc>
+          <w:tcPr/>
+          <w:p>
+            <w:pPr>
+              <w:pStyle w:val="Compact"/>
+            </w:pPr>
+            <w:r>
+              <w:rPr>
+                <w:b/>
+                <w:bCs/>
+              </w:rPr>
+              <w:t xml:space="preserve">OutOfSync (허용)</w:t>
+            </w:r>
+          </w:p>
+        </w:tc>
+        <w:tc>
+          <w:tcPr/>
+          <w:p>
+            <w:pPr>
+              <w:pStyle w:val="Compact"/>
+            </w:pPr>
+            <w:r>
+              <w:t xml:space="preserve">ExternalSecret spec defaulting — ignoreDifferences 반영 후 재sync 필요</w:t>
+            </w:r>
+          </w:p>
+        </w:tc>
+      </w:tr>
+      <w:tr>
+        <w:tc>
+          <w:tcPr/>
+          <w:p>
+            <w:pPr>
+              <w:pStyle w:val="Compact"/>
+            </w:pPr>
+            <w:r>
+              <w:t xml:space="preserve">18</w:t>
+            </w:r>
+          </w:p>
+        </w:tc>
+        <w:tc>
+          <w:tcPr/>
+          <w:p>
+            <w:pPr>
+              <w:pStyle w:val="Compact"/>
+            </w:pPr>
+            <w:r>
+              <w:rPr>
+                <w:rStyle w:val="VerbatimChar"/>
+              </w:rPr>
+              <w:t xml:space="preserve">manifests-integration-hub</w:t>
+            </w:r>
+          </w:p>
+        </w:tc>
+        <w:tc>
+          <w:tcPr/>
+          <w:p>
+            <w:pPr>
+              <w:pStyle w:val="Compact"/>
+            </w:pPr>
+            <w:r>
+              <w:rPr>
+                <w:b/>
+                <w:bCs/>
+              </w:rPr>
+              <w:t xml:space="preserve">Synced/Healthy</w:t>
+            </w:r>
+          </w:p>
+        </w:tc>
+        <w:tc>
+          <w:tcPr/>
+          <w:p>
+            <w:pPr>
+              <w:pStyle w:val="Compact"/>
+            </w:pPr>
+            <w:r>
+              <w:t xml:space="preserve">-</w:t>
+            </w:r>
+          </w:p>
+        </w:tc>
+      </w:tr>
+      <w:tr>
+        <w:tc>
+          <w:tcPr/>
+          <w:p>
+            <w:pPr>
+              <w:pStyle w:val="Compact"/>
+            </w:pPr>
+            <w:r>
+              <w:t xml:space="preserve">19</w:t>
+            </w:r>
+          </w:p>
+        </w:tc>
+        <w:tc>
+          <w:tcPr/>
+          <w:p>
+            <w:pPr>
+              <w:pStyle w:val="Compact"/>
+            </w:pPr>
+            <w:r>
+              <w:rPr>
+                <w:rStyle w:val="VerbatimChar"/>
+              </w:rPr>
+              <w:t xml:space="preserve">manifests-ocr-worker</w:t>
+            </w:r>
+          </w:p>
+        </w:tc>
+        <w:tc>
+          <w:tcPr/>
+          <w:p>
+            <w:pPr>
+              <w:pStyle w:val="Compact"/>
+            </w:pPr>
+            <w:r>
+              <w:rPr>
+                <w:b/>
+                <w:bCs/>
+              </w:rPr>
+              <w:t xml:space="preserve">Synced/Healthy</w:t>
+            </w:r>
+          </w:p>
+        </w:tc>
+        <w:tc>
+          <w:tcPr/>
+          <w:p>
+            <w:pPr>
+              <w:pStyle w:val="Compact"/>
+            </w:pPr>
+            <w:r>
+              <w:t xml:space="preserve">-</w:t>
+            </w:r>
+          </w:p>
+        </w:tc>
+      </w:tr>
+      <w:tr>
+        <w:tc>
+          <w:tcPr/>
+          <w:p>
+            <w:pPr>
+              <w:pStyle w:val="Compact"/>
+            </w:pPr>
+            <w:r>
+              <w:t xml:space="preserve">20</w:t>
+            </w:r>
+          </w:p>
+        </w:tc>
+        <w:tc>
+          <w:tcPr/>
+          <w:p>
+            <w:pPr>
+              <w:pStyle w:val="Compact"/>
+            </w:pPr>
+            <w:r>
+              <w:rPr>
+                <w:rStyle w:val="VerbatimChar"/>
+              </w:rPr>
+              <w:t xml:space="preserve">manifests-ocr-worker-paddle</w:t>
+            </w:r>
+          </w:p>
+        </w:tc>
+        <w:tc>
+          <w:tcPr/>
+          <w:p>
+            <w:pPr>
+              <w:pStyle w:val="Compact"/>
+            </w:pPr>
+            <w:r>
+              <w:rPr>
+                <w:b/>
+                <w:bCs/>
+              </w:rPr>
+              <w:t xml:space="preserve">Synced/Healthy</w:t>
+            </w:r>
+          </w:p>
+        </w:tc>
+        <w:tc>
+          <w:tcPr/>
+          <w:p>
+            <w:pPr>
+              <w:pStyle w:val="Compact"/>
+            </w:pPr>
+            <w:r>
+              <w:t xml:space="preserve">-</w:t>
+            </w:r>
+          </w:p>
+        </w:tc>
+      </w:tr>
+      <w:tr>
+        <w:tc>
+          <w:tcPr/>
+          <w:p>
+            <w:pPr>
+              <w:pStyle w:val="Compact"/>
+            </w:pPr>
+            <w:r>
+              <w:t xml:space="preserve">21</w:t>
+            </w:r>
+          </w:p>
+        </w:tc>
+        <w:tc>
+          <w:tcPr/>
+          <w:p>
+            <w:pPr>
+              <w:pStyle w:val="Compact"/>
+            </w:pPr>
+            <w:r>
+              <w:rPr>
+                <w:rStyle w:val="VerbatimChar"/>
+              </w:rPr>
+              <w:t xml:space="preserve">manifests-admin-ui</w:t>
+            </w:r>
+          </w:p>
+        </w:tc>
+        <w:tc>
+          <w:tcPr/>
+          <w:p>
+            <w:pPr>
+              <w:pStyle w:val="Compact"/>
+            </w:pPr>
+            <w:r>
+              <w:rPr>
+                <w:b/>
+                <w:bCs/>
+              </w:rPr>
+              <w:t xml:space="preserve">Synced/Healthy</w:t>
+            </w:r>
+          </w:p>
+        </w:tc>
+        <w:tc>
+          <w:tcPr/>
+          <w:p>
+            <w:pPr>
+              <w:pStyle w:val="Compact"/>
+            </w:pPr>
+            <w:r>
+              <w:t xml:space="preserve">-</w:t>
+            </w:r>
+          </w:p>
+        </w:tc>
+      </w:tr>
+      <w:tr>
+        <w:tc>
+          <w:tcPr/>
+          <w:p>
+            <w:pPr>
+              <w:pStyle w:val="Compact"/>
+            </w:pPr>
+            <w:r>
+              <w:t xml:space="preserve">22</w:t>
+            </w:r>
+          </w:p>
+        </w:tc>
+        <w:tc>
+          <w:tcPr/>
+          <w:p>
+            <w:pPr>
+              <w:pStyle w:val="Compact"/>
+            </w:pPr>
+            <w:r>
+              <w:rPr>
+                <w:rStyle w:val="VerbatimChar"/>
+              </w:rPr>
+              <w:t xml:space="preserve">manifests-observability</w:t>
+            </w:r>
+          </w:p>
+        </w:tc>
+        <w:tc>
+          <w:tcPr/>
+          <w:p>
+            <w:pPr>
+              <w:pStyle w:val="Compact"/>
+            </w:pPr>
+            <w:r>
+              <w:rPr>
+                <w:b/>
+                <w:bCs/>
+              </w:rPr>
+              <w:t xml:space="preserve">Synced/Healthy</w:t>
+            </w:r>
+          </w:p>
+        </w:tc>
+        <w:tc>
+          <w:tcPr/>
+          <w:p>
+            <w:pPr>
+              <w:pStyle w:val="Compact"/>
+            </w:pPr>
+            <w:r>
+              <w:t xml:space="preserve">OpenBao policy 수정 후 ESO 재sync</w:t>
+            </w:r>
+          </w:p>
+        </w:tc>
+      </w:tr>
+      <w:tr>
+        <w:tc>
+          <w:tcPr/>
+          <w:p>
+            <w:pPr>
+              <w:pStyle w:val="Compact"/>
+            </w:pPr>
+            <w:r>
+              <w:t xml:space="preserve">23</w:t>
+            </w:r>
+          </w:p>
+        </w:tc>
+        <w:tc>
+          <w:tcPr/>
+          <w:p>
+            <w:pPr>
+              <w:pStyle w:val="Compact"/>
+            </w:pPr>
+            <w:r>
+              <w:rPr>
+                <w:rStyle w:val="VerbatimChar"/>
+              </w:rPr>
+              <w:t xml:space="preserve">manifests-fluentbit</w:t>
+            </w:r>
+          </w:p>
+        </w:tc>
+        <w:tc>
+          <w:tcPr/>
+          <w:p>
+            <w:pPr>
+              <w:pStyle w:val="Compact"/>
+            </w:pPr>
+            <w:r>
+              <w:rPr>
+                <w:b/>
+                <w:bCs/>
+              </w:rPr>
+              <w:t xml:space="preserve">Synced/Healthy</w:t>
+            </w:r>
+          </w:p>
+        </w:tc>
+        <w:tc>
+          <w:tcPr/>
+          <w:p>
+            <w:pPr>
+              <w:pStyle w:val="Compact"/>
+            </w:pPr>
+            <w:r>
+              <w:t xml:space="preserve">OpenBao policy 수정 후 ESO 재sync</w:t>
+            </w:r>
+          </w:p>
+        </w:tc>
+      </w:tr>
+      <w:tr>
+        <w:tc>
+          <w:tcPr/>
+          <w:p>
+            <w:pPr>
+              <w:pStyle w:val="Compact"/>
+            </w:pPr>
+            <w:r>
+              <w:t xml:space="preserve">-</w:t>
+            </w:r>
+          </w:p>
+        </w:tc>
+        <w:tc>
+          <w:tcPr/>
+          <w:p>
+            <w:pPr>
+              <w:pStyle w:val="Compact"/>
+            </w:pPr>
+            <w:r>
+              <w:rPr>
+                <w:rStyle w:val="VerbatimChar"/>
+              </w:rPr>
+              <w:t xml:space="preserve">manifests-postgres</w:t>
+            </w:r>
+          </w:p>
+        </w:tc>
+        <w:tc>
+          <w:tcPr/>
+          <w:p>
+            <w:pPr>
+              <w:pStyle w:val="Compact"/>
+            </w:pPr>
+            <w:r>
+              <w:rPr>
+                <w:b/>
+                <w:bCs/>
+              </w:rPr>
+              <w:t xml:space="preserve">SKIP</w:t>
+            </w:r>
+          </w:p>
+        </w:tc>
+        <w:tc>
+          <w:tcPr/>
+          <w:p>
+            <w:pPr>
+              <w:pStyle w:val="Compact"/>
+            </w:pPr>
+            <w:r>
+              <w:t xml:space="preserve">pg-main Cluster 상태 불안정(Unknown) — data risk</w:t>
+            </w:r>
+          </w:p>
+        </w:tc>
+      </w:tr>
+      <w:tr>
+        <w:tc>
+          <w:tcPr/>
+          <w:p>
+            <w:pPr>
+              <w:pStyle w:val="Compact"/>
+            </w:pPr>
+            <w:r>
+              <w:t xml:space="preserve">-</w:t>
+            </w:r>
+          </w:p>
+        </w:tc>
+        <w:tc>
+          <w:tcPr/>
+          <w:p>
+            <w:pPr>
+              <w:pStyle w:val="Compact"/>
+            </w:pPr>
+            <w:r>
+              <w:rPr>
+                <w:rStyle w:val="VerbatimChar"/>
+              </w:rPr>
+              <w:t xml:space="preserve">ocr-argocd-self</w:t>
+            </w:r>
+          </w:p>
+        </w:tc>
+        <w:tc>
+          <w:tcPr/>
+          <w:p>
+            <w:pPr>
+              <w:pStyle w:val="Compact"/>
+            </w:pPr>
+            <w:r>
+              <w:rPr>
+                <w:b/>
+                <w:bCs/>
+              </w:rPr>
+              <w:t xml:space="preserve">SKIP</w:t>
+            </w:r>
+          </w:p>
+        </w:tc>
+        <w:tc>
+          <w:tcPr/>
+          <w:p>
+            <w:pPr>
+              <w:pStyle w:val="Compact"/>
+            </w:pPr>
+            <w:r>
+              <w:t xml:space="preserve">의도적 — circular dependency 위험</w:t>
+            </w:r>
+          </w:p>
+        </w:tc>
+      </w:tr>
+      <w:tr>
+        <w:tc>
+          <w:tcPr/>
+          <w:p>
+            <w:pPr>
+              <w:pStyle w:val="Compact"/>
+            </w:pPr>
+            <w:r>
+              <w:t xml:space="preserve">-</w:t>
+            </w:r>
+          </w:p>
+        </w:tc>
+        <w:tc>
+          <w:tcPr/>
+          <w:p>
+            <w:pPr>
+              <w:pStyle w:val="Compact"/>
+            </w:pPr>
+            <w:r>
+              <w:rPr>
+                <w:rStyle w:val="VerbatimChar"/>
+              </w:rPr>
+              <w:t xml:space="preserve">ocr-root</w:t>
+            </w:r>
+          </w:p>
+        </w:tc>
+        <w:tc>
+          <w:tcPr/>
+          <w:p>
+            <w:pPr>
+              <w:pStyle w:val="Compact"/>
+            </w:pPr>
+            <w:r>
+              <w:rPr>
+                <w:b/>
+                <w:bCs/>
+              </w:rPr>
+              <w:t xml:space="preserve">SKIP</w:t>
+            </w:r>
+          </w:p>
+        </w:tc>
+        <w:tc>
+          <w:tcPr/>
+          <w:p>
+            <w:pPr>
+              <w:pStyle w:val="Compact"/>
+            </w:pPr>
+            <w:r>
+              <w:t xml:space="preserve">App-of-Apps root — 수동 sync 불필요</w:t>
+            </w:r>
+          </w:p>
+        </w:tc>
+      </w:tr>
+      <w:tr>
+        <w:tc>
+          <w:tcPr/>
+          <w:p>
+            <w:pPr>
+              <w:pStyle w:val="Compact"/>
+            </w:pPr>
+            <w:r>
+              <w:t xml:space="preserve">-</w:t>
+            </w:r>
+          </w:p>
+        </w:tc>
+        <w:tc>
+          <w:tcPr/>
+          <w:p>
+            <w:pPr>
+              <w:pStyle w:val="Compact"/>
+            </w:pPr>
+            <w:r>
+              <w:rPr>
+                <w:rStyle w:val="VerbatimChar"/>
+              </w:rPr>
+              <w:t xml:space="preserve">manifests-argocd</w:t>
+            </w:r>
+          </w:p>
+        </w:tc>
+        <w:tc>
+          <w:tcPr/>
+          <w:p>
+            <w:pPr>
+              <w:pStyle w:val="Compact"/>
+            </w:pPr>
+            <w:r>
+              <w:rPr>
+                <w:b/>
+                <w:bCs/>
+              </w:rPr>
+              <w:t xml:space="preserve">SKIP</w:t>
+            </w:r>
+          </w:p>
+        </w:tc>
+        <w:tc>
+          <w:tcPr/>
+          <w:p>
+            <w:pPr>
+              <w:pStyle w:val="Compact"/>
+            </w:pPr>
+            <w:r>
+              <w:t xml:space="preserve">ArgoCD 자체 manifest — 별도 관리</w:t>
+            </w:r>
+          </w:p>
+        </w:tc>
+      </w:tr>
+    </w:tbl>
+    <w:bookmarkEnd w:id="32"/>
+    <w:bookmarkStart w:id="37" w:name="변경-내역"/>
+    <w:p>
+      <w:pPr>
+        <w:pStyle w:val="Heading3"/>
+      </w:pPr>
+      <w:r>
+        <w:t xml:space="preserve">변경 내역</w:t>
+      </w:r>
+    </w:p>
+    <w:bookmarkStart w:id="33" w:name="Xd8254b960b2964527709c67629cea8bbfe7f9cc"/>
+    <w:p>
+      <w:pPr>
+        <w:pStyle w:val="Heading4"/>
+      </w:pPr>
+      <w:r>
+        <w:t xml:space="preserve">1. ApplicationSet ignoreDifferences 확장 (</w:t>
+      </w:r>
+      <w:r>
+        <w:rPr>
+          <w:rStyle w:val="VerbatimChar"/>
+        </w:rPr>
+        <w:t xml:space="preserve">infra/argocd/apps/10-manifests.yaml</w:t>
+      </w:r>
+      <w:r>
+        <w:t xml:space="preserve">)</w:t>
+      </w:r>
+    </w:p>
+    <w:p>
+      <w:pPr>
+        <w:pStyle w:val="Compact"/>
+        <w:numPr>
+          <w:ilvl w:val="0"/>
+          <w:numId w:val="1005"/>
+        </w:numPr>
+      </w:pPr>
+      <w:r>
+        <w:rPr>
+          <w:rStyle w:val="VerbatimChar"/>
+        </w:rPr>
+        <w:t xml:space="preserve">*.md</w:t>
+      </w:r>
+      <w:r>
+        <w:t xml:space="preserve"> </w:t>
+      </w:r>
+      <w:r>
+        <w:t xml:space="preserve">외</w:t>
+      </w:r>
+      <w:r>
+        <w:t xml:space="preserve"> </w:t>
+      </w:r>
+      <w:r>
+        <w:rPr>
+          <w:rStyle w:val="VerbatimChar"/>
+        </w:rPr>
+        <w:t xml:space="preserve">*.json</w:t>
+      </w:r>
+      <w:r>
+        <w:t xml:space="preserve"> </w:t>
+      </w:r>
+      <w:r>
+        <w:t xml:space="preserve">파일도 ArgoCD 파싱 대상에서 제외 (</w:t>
+      </w:r>
+      <w:r>
+        <w:rPr>
+          <w:rStyle w:val="VerbatimChar"/>
+        </w:rPr>
+        <w:t xml:space="preserve">{*.md,*.json}</w:t>
+      </w:r>
+      <w:r>
+        <w:t xml:space="preserve">)</w:t>
+      </w:r>
+    </w:p>
+    <w:p>
+      <w:pPr>
+        <w:pStyle w:val="Compact"/>
+        <w:numPr>
+          <w:ilvl w:val="0"/>
+          <w:numId w:val="1005"/>
+        </w:numPr>
+      </w:pPr>
+      <w:r>
+        <w:t xml:space="preserve">ExternalSecret</w:t>
+      </w:r>
+      <w:r>
+        <w:t xml:space="preserve"> </w:t>
+      </w:r>
+      <w:r>
+        <w:rPr>
+          <w:rStyle w:val="VerbatimChar"/>
+        </w:rPr>
+        <w:t xml:space="preserve">ignoreDifferences</w:t>
+      </w:r>
+      <w:r>
+        <w:t xml:space="preserve">에</w:t>
+      </w:r>
+      <w:r>
+        <w:t xml:space="preserve"> </w:t>
+      </w:r>
+      <w:r>
+        <w:rPr>
+          <w:rStyle w:val="VerbatimChar"/>
+        </w:rPr>
+        <w:t xml:space="preserve">/spec/data</w:t>
+      </w:r>
+      <w:r>
+        <w:t xml:space="preserve"> </w:t>
+      </w:r>
+      <w:r>
+        <w:t xml:space="preserve">및</w:t>
+      </w:r>
+      <w:r>
+        <w:t xml:space="preserve"> </w:t>
+      </w:r>
+      <w:r>
+        <w:rPr>
+          <w:rStyle w:val="VerbatimChar"/>
+        </w:rPr>
+        <w:t xml:space="preserve">/spec/target/deletionPolicy</w:t>
+      </w:r>
+      <w:r>
+        <w:t xml:space="preserve"> </w:t>
+      </w:r>
+      <w:r>
+        <w:t xml:space="preserve">추가</w:t>
+      </w:r>
+    </w:p>
+    <w:p>
+      <w:pPr>
+        <w:pStyle w:val="Compact"/>
+        <w:numPr>
+          <w:ilvl w:val="1"/>
+          <w:numId w:val="1006"/>
+        </w:numPr>
+      </w:pPr>
+      <w:r>
+        <w:t xml:space="preserve">원인: ESO admission webhook이 spec defaulting 필드를 추가 → 매 sync마다 drift 발생</w:t>
+      </w:r>
+    </w:p>
+    <w:bookmarkEnd w:id="33"/>
+    <w:bookmarkStart w:id="34" w:name="X9577af55f411008bc726c53718de12c7bf1951d"/>
+    <w:p>
+      <w:pPr>
+        <w:pStyle w:val="Heading4"/>
+      </w:pPr>
+      <w:r>
+        <w:t xml:space="preserve">2. Keycloak realm export 이동</w:t>
+      </w:r>
+    </w:p>
+    <w:p>
+      <w:pPr>
+        <w:pStyle w:val="Compact"/>
+        <w:numPr>
+          <w:ilvl w:val="0"/>
+          <w:numId w:val="1007"/>
+        </w:numPr>
+      </w:pPr>
+      <w:r>
+        <w:rPr>
+          <w:rStyle w:val="VerbatimChar"/>
+        </w:rPr>
+        <w:t xml:space="preserve">infra/manifests/keycloak/realm-ocr.json</w:t>
+      </w:r>
+      <w:r>
+        <w:t xml:space="preserve"> </w:t>
+      </w:r>
+      <w:r>
+        <w:t xml:space="preserve">→</w:t>
+      </w:r>
+      <w:r>
+        <w:t xml:space="preserve"> </w:t>
+      </w:r>
+      <w:r>
+        <w:rPr>
+          <w:rStyle w:val="VerbatimChar"/>
+        </w:rPr>
+        <w:t xml:space="preserve">infra/keycloak-realm/realm-ocr.json</w:t>
+      </w:r>
+    </w:p>
+    <w:p>
+      <w:pPr>
+        <w:pStyle w:val="Compact"/>
+        <w:numPr>
+          <w:ilvl w:val="0"/>
+          <w:numId w:val="1007"/>
+        </w:numPr>
+      </w:pPr>
+      <w:r>
+        <w:t xml:space="preserve">원인: ArgoCD manifests ApplicationSet이 realm JSON을 k8s manifest로 파싱 시도 → Unknown 상태</w:t>
+      </w:r>
+    </w:p>
+    <w:p>
+      <w:pPr>
+        <w:pStyle w:val="Compact"/>
+        <w:numPr>
+          <w:ilvl w:val="0"/>
+          <w:numId w:val="1007"/>
+        </w:numPr>
+      </w:pPr>
+      <w:r>
+        <w:rPr>
+          <w:rStyle w:val="VerbatimChar"/>
+        </w:rPr>
+        <w:t xml:space="preserve">manifests-keycloak</w:t>
+      </w:r>
+      <w:r>
+        <w:t xml:space="preserve"> </w:t>
+      </w:r>
+      <w:r>
+        <w:t xml:space="preserve">App 재sync 후 정상화 예정</w:t>
+      </w:r>
+    </w:p>
+    <w:bookmarkEnd w:id="34"/>
+    <w:bookmarkStart w:id="35" w:name="X632ffd77931d059a48b021414cc5be1e343886b"/>
+    <w:p>
+      <w:pPr>
+        <w:pStyle w:val="Heading4"/>
+      </w:pPr>
+      <w:r>
+        <w:t xml:space="preserve">3. OpenBao ESO 정책 확장</w:t>
+      </w:r>
+    </w:p>
+    <w:p>
+      <w:pPr>
+        <w:pStyle w:val="Compact"/>
+        <w:numPr>
+          <w:ilvl w:val="0"/>
+          <w:numId w:val="1008"/>
+        </w:numPr>
+      </w:pPr>
+      <w:r>
+        <w:rPr>
+          <w:rStyle w:val="VerbatimChar"/>
+        </w:rPr>
+        <w:t xml:space="preserve">eso-admin-reader</w:t>
+      </w:r>
+      <w:r>
+        <w:t xml:space="preserve"> </w:t>
+      </w:r>
+      <w:r>
+        <w:t xml:space="preserve">policy에</w:t>
+      </w:r>
+      <w:r>
+        <w:t xml:space="preserve"> </w:t>
+      </w:r>
+      <w:r>
+        <w:rPr>
+          <w:rStyle w:val="VerbatimChar"/>
+        </w:rPr>
+        <w:t xml:space="preserve">kv/data/observability/*</w:t>
+      </w:r>
+      <w:r>
+        <w:t xml:space="preserve"> </w:t>
+      </w:r>
+      <w:r>
+        <w:t xml:space="preserve">경로 추가</w:t>
+      </w:r>
+    </w:p>
+    <w:p>
+      <w:pPr>
+        <w:pStyle w:val="Compact"/>
+        <w:numPr>
+          <w:ilvl w:val="0"/>
+          <w:numId w:val="1008"/>
+        </w:numPr>
+      </w:pPr>
+      <w:r>
+        <w:t xml:space="preserve">원인: ExternalSecret</w:t>
+      </w:r>
+      <w:r>
+        <w:t xml:space="preserve"> </w:t>
+      </w:r>
+      <w:r>
+        <w:rPr>
+          <w:rStyle w:val="VerbatimChar"/>
+        </w:rPr>
+        <w:t xml:space="preserve">opensearch-admin-creds</w:t>
+      </w:r>
+      <w:r>
+        <w:t xml:space="preserve">,</w:t>
+      </w:r>
+      <w:r>
+        <w:t xml:space="preserve"> </w:t>
+      </w:r>
+      <w:r>
+        <w:rPr>
+          <w:rStyle w:val="VerbatimChar"/>
+        </w:rPr>
+        <w:t xml:space="preserve">opensearch-fluentbit-creds</w:t>
+      </w:r>
+      <w:r>
+        <w:t xml:space="preserve">가 OpenBao의 observability/ 경로에 접근 필요했으나 policy 미포함</w:t>
+      </w:r>
+    </w:p>
+    <w:p>
+      <w:pPr>
+        <w:pStyle w:val="Compact"/>
+        <w:numPr>
+          <w:ilvl w:val="0"/>
+          <w:numId w:val="1008"/>
+        </w:numPr>
+      </w:pPr>
+      <w:r>
+        <w:t xml:space="preserve">영향: manifests-observability, manifests-fluentbit의 ExternalSecret Degraded 해소</w:t>
+      </w:r>
+    </w:p>
+    <w:bookmarkEnd w:id="35"/>
+    <w:bookmarkStart w:id="36" w:name="X97bbbdf44186cb34c1fddb647bdb0d040233f79"/>
+    <w:p>
+      <w:pPr>
+        <w:pStyle w:val="Heading4"/>
+      </w:pPr>
+      <w:r>
+        <w:t xml:space="preserve">4. ArgoCD ownership label 소급 추가</w:t>
+      </w:r>
+    </w:p>
+    <w:p>
+      <w:pPr>
+        <w:pStyle w:val="Compact"/>
+        <w:numPr>
+          <w:ilvl w:val="0"/>
+          <w:numId w:val="1009"/>
+        </w:numPr>
+      </w:pPr>
+      <w:r>
+        <w:rPr>
+          <w:rStyle w:val="VerbatimChar"/>
+        </w:rPr>
+        <w:t xml:space="preserve">manifests-upload-api</w:t>
+      </w:r>
+      <w:r>
+        <w:t xml:space="preserve"> </w:t>
+      </w:r>
+      <w:r>
+        <w:t xml:space="preserve">(dmz ns),</w:t>
+      </w:r>
+      <w:r>
+        <w:t xml:space="preserve"> </w:t>
+      </w:r>
+      <w:r>
+        <w:rPr>
+          <w:rStyle w:val="VerbatimChar"/>
+        </w:rPr>
+        <w:t xml:space="preserve">manifests-fpe-service</w:t>
+      </w:r>
+      <w:r>
+        <w:t xml:space="preserve"> </w:t>
+      </w:r>
+      <w:r>
+        <w:t xml:space="preserve">(security ns) 리소스에</w:t>
+      </w:r>
+      <w:r>
+        <w:t xml:space="preserve"> </w:t>
+      </w:r>
+      <w:r>
+        <w:rPr>
+          <w:rStyle w:val="VerbatimChar"/>
+        </w:rPr>
+        <w:t xml:space="preserve">app.kubernetes.io/instance</w:t>
+      </w:r>
+      <w:r>
+        <w:t xml:space="preserve"> </w:t>
+      </w:r>
+      <w:r>
+        <w:t xml:space="preserve">label 추가</w:t>
+      </w:r>
+    </w:p>
+    <w:p>
+      <w:pPr>
+        <w:pStyle w:val="Compact"/>
+        <w:numPr>
+          <w:ilvl w:val="0"/>
+          <w:numId w:val="1009"/>
+        </w:numPr>
+      </w:pPr>
+      <w:r>
+        <w:t xml:space="preserve">원인: 과거</w:t>
+      </w:r>
+      <w:r>
+        <w:t xml:space="preserve"> </w:t>
+      </w:r>
+      <w:r>
+        <w:rPr>
+          <w:rStyle w:val="VerbatimChar"/>
+        </w:rPr>
+        <w:t xml:space="preserve">kubectl apply</w:t>
+      </w:r>
+      <w:r>
+        <w:t xml:space="preserve">로 배포된 리소스에 ArgoCD 소유권 표시 없어 Missing 상태</w:t>
+      </w:r>
+    </w:p>
+    <w:bookmarkEnd w:id="36"/>
+    <w:bookmarkEnd w:id="37"/>
+    <w:bookmarkStart w:id="38" w:name="잔여-이슈-이월"/>
+    <w:p>
+      <w:pPr>
+        <w:pStyle w:val="Heading3"/>
+      </w:pPr>
+      <w:r>
+        <w:t xml:space="preserve">잔여 이슈 (이월)</w:t>
+      </w:r>
+    </w:p>
+    <w:p>
+      <w:pPr>
+        <w:pStyle w:val="Compact"/>
+        <w:numPr>
+          <w:ilvl w:val="0"/>
+          <w:numId w:val="1010"/>
+        </w:numPr>
+      </w:pPr>
+      <w:r>
+        <w:rPr>
+          <w:rStyle w:val="VerbatimChar"/>
+          <w:b/>
+          <w:bCs/>
+        </w:rPr>
+        <w:t xml:space="preserve">manifests-keycloak</w:t>
+      </w:r>
+      <w:r>
+        <w:t xml:space="preserve">: realm-ocr.json 이동 커밋 후 ArgoCD refresh → sync 필요</w:t>
+      </w:r>
+    </w:p>
+    <w:p>
+      <w:pPr>
+        <w:pStyle w:val="Compact"/>
+        <w:numPr>
+          <w:ilvl w:val="0"/>
+          <w:numId w:val="1010"/>
+        </w:numPr>
+      </w:pPr>
+      <w:r>
+        <w:rPr>
+          <w:rStyle w:val="VerbatimChar"/>
+          <w:b/>
+          <w:bCs/>
+        </w:rPr>
+        <w:t xml:space="preserve">manifests-fpe-service</w:t>
+      </w:r>
+      <w:r>
+        <w:t xml:space="preserve">: ExternalSecret ignoreDifferences 적용 커밋 후 재sync</w:t>
+      </w:r>
+    </w:p>
+    <w:p>
+      <w:pPr>
+        <w:pStyle w:val="Compact"/>
+        <w:numPr>
+          <w:ilvl w:val="0"/>
+          <w:numId w:val="1010"/>
+        </w:numPr>
+      </w:pPr>
+      <w:r>
+        <w:rPr>
+          <w:rStyle w:val="VerbatimChar"/>
+          <w:b/>
+          <w:bCs/>
+        </w:rPr>
+        <w:t xml:space="preserve">manifests-external-secrets</w:t>
+      </w:r>
+      <w:r>
+        <w:t xml:space="preserve">: 동일 (ESO spec defaulting)</w:t>
+      </w:r>
+    </w:p>
+    <w:p>
+      <w:pPr>
+        <w:pStyle w:val="Compact"/>
+        <w:numPr>
+          <w:ilvl w:val="0"/>
+          <w:numId w:val="1010"/>
+        </w:numPr>
+      </w:pPr>
+      <w:r>
+        <w:rPr>
+          <w:rStyle w:val="VerbatimChar"/>
+          <w:b/>
+          <w:bCs/>
+        </w:rPr>
+        <w:t xml:space="preserve">manifests-postgres</w:t>
+      </w:r>
+      <w:r>
+        <w:t xml:space="preserve">: pg-main Cluster 상태 불안정 — 별도 CNPG 점검 후 처리</w:t>
+      </w:r>
+    </w:p>
+    <w:p>
+      <w:pPr>
+        <w:pStyle w:val="Compact"/>
+        <w:numPr>
+          <w:ilvl w:val="0"/>
+          <w:numId w:val="1010"/>
+        </w:numPr>
+      </w:pPr>
+      <w:r>
+        <w:rPr>
+          <w:b/>
+          <w:bCs/>
+        </w:rPr>
+        <w:t xml:space="preserve">CRD annotation too large</w:t>
+      </w:r>
+      <w:r>
+        <w:t xml:space="preserve">: ocr-cnpg, ocr-external-secrets, ocr-kps — 기능 정상, phase=Failed는 cosmetic. ArgoCD v3에서 Replace=true 옵션으로 해결 가능</w:t>
+      </w:r>
+    </w:p>
+    <w:bookmarkEnd w:id="38"/>
+    <w:bookmarkStart w:id="39" w:name="openbao-정책-변경-명령-재현"/>
+    <w:p>
+      <w:pPr>
+        <w:pStyle w:val="Heading3"/>
+      </w:pPr>
+      <w:r>
+        <w:t xml:space="preserve">OpenBao 정책 변경 명령 (재현)</w:t>
+      </w:r>
+    </w:p>
+    <w:p>
+      <w:pPr>
+        <w:pStyle w:val="SourceCode"/>
+      </w:pPr>
+      <w:r>
+        <w:rPr>
+          <w:rStyle w:val="CommentTok"/>
+        </w:rPr>
+        <w:t xml:space="preserve"># 이 명령은 2026-04-23에 실행됨 (OpenBao raft에 저장)</w:t>
+      </w:r>
+      <w:r>
+        <w:br/>
+      </w:r>
+      <w:r>
+        <w:rPr>
+          <w:rStyle w:val="CommentTok"/>
+        </w:rPr>
+        <w:t xml:space="preserve"># 재현이 필요한 경우:</w:t>
+      </w:r>
+      <w:r>
+        <w:br/>
+      </w:r>
+      <w:r>
+        <w:rPr>
+          <w:rStyle w:val="VariableTok"/>
+        </w:rPr>
+        <w:t xml:space="preserve">ROOT_TOKEN</w:t>
+      </w:r>
+      <w:r>
+        <w:rPr>
+          <w:rStyle w:val="OperatorTok"/>
+        </w:rPr>
+        <w:t xml:space="preserve">=</w:t>
+      </w:r>
+      <w:r>
+        <w:rPr>
+          <w:rStyle w:val="VariableTok"/>
+        </w:rPr>
+        <w:t xml:space="preserve">$(</w:t>
+      </w:r>
+      <w:r>
+        <w:rPr>
+          <w:rStyle w:val="ExtensionTok"/>
+        </w:rPr>
+        <w:t xml:space="preserve">kubectl</w:t>
+      </w:r>
+      <w:r>
+        <w:rPr>
+          <w:rStyle w:val="NormalTok"/>
+        </w:rPr>
+        <w:t xml:space="preserve"> </w:t>
+      </w:r>
+      <w:r>
+        <w:rPr>
+          <w:rStyle w:val="AttributeTok"/>
+        </w:rPr>
+        <w:t xml:space="preserve">-n</w:t>
+      </w:r>
+      <w:r>
+        <w:rPr>
+          <w:rStyle w:val="NormalTok"/>
+        </w:rPr>
+        <w:t xml:space="preserve"> security get secret openbao-init-keys </w:t>
+      </w:r>
+      <w:r>
+        <w:rPr>
+          <w:rStyle w:val="DataTypeTok"/>
+        </w:rPr>
+        <w:t xml:space="preserve">\</w:t>
+      </w:r>
+      <w:r>
+        <w:br/>
+      </w:r>
+      <w:r>
+        <w:rPr>
+          <w:rStyle w:val="NormalTok"/>
+        </w:rPr>
+        <w:t xml:space="preserve">  </w:t>
+      </w:r>
+      <w:r>
+        <w:rPr>
+          <w:rStyle w:val="AttributeTok"/>
+        </w:rPr>
+        <w:t xml:space="preserve">-o</w:t>
+      </w:r>
+      <w:r>
+        <w:rPr>
+          <w:rStyle w:val="NormalTok"/>
+        </w:rPr>
+        <w:t xml:space="preserve"> jsonpath=</w:t>
+      </w:r>
+      <w:r>
+        <w:rPr>
+          <w:rStyle w:val="StringTok"/>
+        </w:rPr>
+        <w:t xml:space="preserve">'{.data.init\.json}'</w:t>
+      </w:r>
+      <w:r>
+        <w:rPr>
+          <w:rStyle w:val="NormalTok"/>
+        </w:rPr>
+        <w:t xml:space="preserve"> </w:t>
+      </w:r>
+      <w:r>
+        <w:rPr>
+          <w:rStyle w:val="KeywordTok"/>
+        </w:rPr>
+        <w:t xml:space="preserve">|</w:t>
+      </w:r>
+      <w:r>
+        <w:rPr>
+          <w:rStyle w:val="NormalTok"/>
+        </w:rPr>
+        <w:t xml:space="preserve"> </w:t>
+      </w:r>
+      <w:r>
+        <w:rPr>
+          <w:rStyle w:val="FunctionTok"/>
+        </w:rPr>
+        <w:t xml:space="preserve">base64</w:t>
+      </w:r>
+      <w:r>
+        <w:rPr>
+          <w:rStyle w:val="NormalTok"/>
+        </w:rPr>
+        <w:t xml:space="preserve"> </w:t>
+      </w:r>
+      <w:r>
+        <w:rPr>
+          <w:rStyle w:val="AttributeTok"/>
+        </w:rPr>
+        <w:t xml:space="preserve">-d</w:t>
+      </w:r>
+      <w:r>
+        <w:rPr>
+          <w:rStyle w:val="NormalTok"/>
+        </w:rPr>
+        <w:t xml:space="preserve"> </w:t>
+      </w:r>
+      <w:r>
+        <w:rPr>
+          <w:rStyle w:val="KeywordTok"/>
+        </w:rPr>
+        <w:t xml:space="preserve">|</w:t>
+      </w:r>
+      <w:r>
+        <w:rPr>
+          <w:rStyle w:val="NormalTok"/>
+        </w:rPr>
+        <w:t xml:space="preserve"> </w:t>
+      </w:r>
+      <w:r>
+        <w:rPr>
+          <w:rStyle w:val="ExtensionTok"/>
+        </w:rPr>
+        <w:t xml:space="preserve">python3</w:t>
+      </w:r>
+      <w:r>
+        <w:rPr>
+          <w:rStyle w:val="NormalTok"/>
+        </w:rPr>
+        <w:t xml:space="preserve"> </w:t>
+      </w:r>
+      <w:r>
+        <w:rPr>
+          <w:rStyle w:val="AttributeTok"/>
+        </w:rPr>
+        <w:t xml:space="preserve">-c</w:t>
+      </w:r>
+      <w:r>
+        <w:rPr>
+          <w:rStyle w:val="NormalTok"/>
+        </w:rPr>
+        <w:t xml:space="preserve"> </w:t>
+      </w:r>
+      <w:r>
+        <w:rPr>
+          <w:rStyle w:val="StringTok"/>
+        </w:rPr>
+        <w:t xml:space="preserve">"import sys,json; print(json.load(sys.stdin)['root_token'])"</w:t>
+      </w:r>
+      <w:r>
+        <w:rPr>
+          <w:rStyle w:val="VariableTok"/>
+        </w:rPr>
+        <w:t xml:space="preserve">)</w:t>
+      </w:r>
+      <w:r>
+        <w:br/>
+      </w:r>
+      <w:r>
+        <w:br/>
+      </w:r>
+      <w:r>
+        <w:rPr>
+          <w:rStyle w:val="ExtensionTok"/>
+        </w:rPr>
+        <w:t xml:space="preserve">kubectl</w:t>
+      </w:r>
+      <w:r>
+        <w:rPr>
+          <w:rStyle w:val="NormalTok"/>
+        </w:rPr>
+        <w:t xml:space="preserve"> </w:t>
+      </w:r>
+      <w:r>
+        <w:rPr>
+          <w:rStyle w:val="AttributeTok"/>
+        </w:rPr>
+        <w:t xml:space="preserve">-n</w:t>
+      </w:r>
+      <w:r>
+        <w:rPr>
+          <w:rStyle w:val="NormalTok"/>
+        </w:rPr>
+        <w:t xml:space="preserve"> security port-forward svc/openbao 8200:8200 </w:t>
+      </w:r>
+      <w:r>
+        <w:rPr>
+          <w:rStyle w:val="KeywordTok"/>
+        </w:rPr>
+        <w:t xml:space="preserve">&amp;</w:t>
+      </w:r>
+      <w:r>
+        <w:br/>
+      </w:r>
+      <w:r>
+        <w:rPr>
+          <w:rStyle w:val="ExtensionTok"/>
+        </w:rPr>
+        <w:t xml:space="preserve">curl</w:t>
+      </w:r>
+      <w:r>
+        <w:rPr>
+          <w:rStyle w:val="NormalTok"/>
+        </w:rPr>
+        <w:t xml:space="preserve"> </w:t>
+      </w:r>
+      <w:r>
+        <w:rPr>
+          <w:rStyle w:val="AttributeTok"/>
+        </w:rPr>
+        <w:t xml:space="preserve">-sk</w:t>
+      </w:r>
+      <w:r>
+        <w:rPr>
+          <w:rStyle w:val="NormalTok"/>
+        </w:rPr>
+        <w:t xml:space="preserve"> </w:t>
+      </w:r>
+      <w:r>
+        <w:rPr>
+          <w:rStyle w:val="AttributeTok"/>
+        </w:rPr>
+        <w:t xml:space="preserve">-X</w:t>
+      </w:r>
+      <w:r>
+        <w:rPr>
+          <w:rStyle w:val="NormalTok"/>
+        </w:rPr>
+        <w:t xml:space="preserve"> POST </w:t>
+      </w:r>
+      <w:r>
+        <w:rPr>
+          <w:rStyle w:val="AttributeTok"/>
+        </w:rPr>
+        <w:t xml:space="preserve">-H</w:t>
+      </w:r>
+      <w:r>
+        <w:rPr>
+          <w:rStyle w:val="NormalTok"/>
+        </w:rPr>
+        <w:t xml:space="preserve"> </w:t>
+      </w:r>
+      <w:r>
+        <w:rPr>
+          <w:rStyle w:val="StringTok"/>
+        </w:rPr>
+        <w:t xml:space="preserve">"X-Vault-Token: </w:t>
+      </w:r>
+      <w:r>
+        <w:rPr>
+          <w:rStyle w:val="VariableTok"/>
+        </w:rPr>
+        <w:t xml:space="preserve">$ROOT_TOKEN</w:t>
+      </w:r>
+      <w:r>
+        <w:rPr>
+          <w:rStyle w:val="StringTok"/>
+        </w:rPr>
+        <w:t xml:space="preserve">"</w:t>
+      </w:r>
+      <w:r>
+        <w:rPr>
+          <w:rStyle w:val="NormalTok"/>
+        </w:rPr>
+        <w:t xml:space="preserve"> </w:t>
+      </w:r>
+      <w:r>
+        <w:rPr>
+          <w:rStyle w:val="DataTypeTok"/>
+        </w:rPr>
+        <w:t xml:space="preserve">\</w:t>
+      </w:r>
+      <w:r>
+        <w:br/>
+      </w:r>
+      <w:r>
+        <w:rPr>
+          <w:rStyle w:val="NormalTok"/>
+        </w:rPr>
+        <w:t xml:space="preserve">  </w:t>
+      </w:r>
+      <w:r>
+        <w:rPr>
+          <w:rStyle w:val="AttributeTok"/>
+        </w:rPr>
+        <w:t xml:space="preserve">-H</w:t>
+      </w:r>
+      <w:r>
+        <w:rPr>
+          <w:rStyle w:val="NormalTok"/>
+        </w:rPr>
+        <w:t xml:space="preserve"> </w:t>
+      </w:r>
+      <w:r>
+        <w:rPr>
+          <w:rStyle w:val="StringTok"/>
+        </w:rPr>
+        <w:t xml:space="preserve">"Content-Type: application/json"</w:t>
+      </w:r>
+      <w:r>
+        <w:rPr>
+          <w:rStyle w:val="NormalTok"/>
+        </w:rPr>
+        <w:t xml:space="preserve"> </w:t>
+      </w:r>
+      <w:r>
+        <w:rPr>
+          <w:rStyle w:val="DataTypeTok"/>
+        </w:rPr>
+        <w:t xml:space="preserve">\</w:t>
+      </w:r>
+      <w:r>
+        <w:br/>
+      </w:r>
+      <w:r>
+        <w:rPr>
+          <w:rStyle w:val="NormalTok"/>
+        </w:rPr>
+        <w:t xml:space="preserve">  </w:t>
+      </w:r>
+      <w:r>
+        <w:rPr>
+          <w:rStyle w:val="StringTok"/>
+        </w:rPr>
+        <w:t xml:space="preserve">"https://localhost:8200/v1/sys/policies/acl/eso-admin-reader"</w:t>
+      </w:r>
+      <w:r>
+        <w:rPr>
+          <w:rStyle w:val="NormalTok"/>
+        </w:rPr>
+        <w:t xml:space="preserve"> </w:t>
+      </w:r>
+      <w:r>
+        <w:rPr>
+          <w:rStyle w:val="DataTypeTok"/>
+        </w:rPr>
+        <w:t xml:space="preserve">\</w:t>
+      </w:r>
+      <w:r>
+        <w:br/>
+      </w:r>
+      <w:r>
+        <w:rPr>
+          <w:rStyle w:val="NormalTok"/>
+        </w:rPr>
+        <w:t xml:space="preserve">  </w:t>
+      </w:r>
+      <w:r>
+        <w:rPr>
+          <w:rStyle w:val="AttributeTok"/>
+        </w:rPr>
+        <w:t xml:space="preserve">-d</w:t>
+      </w:r>
+      <w:r>
+        <w:rPr>
+          <w:rStyle w:val="NormalTok"/>
+        </w:rPr>
+        <w:t xml:space="preserve"> </w:t>
+      </w:r>
+      <w:r>
+        <w:rPr>
+          <w:rStyle w:val="StringTok"/>
+        </w:rPr>
+        <w:t xml:space="preserve">'{</w:t>
+      </w:r>
+      <w:r>
+        <w:br/>
+      </w:r>
+      <w:r>
+        <w:rPr>
+          <w:rStyle w:val="StringTok"/>
+        </w:rPr>
+        <w:t xml:space="preserve">    "policy": "path \"kv/data/admin/*\" { capabilities = [\"read\"] }\npath \"kv/metadata/admin/*\" { capabilities = [\"read\", \"list\"] }\npath \"kv/data/security/*\" { capabilities = [\"read\"] }\npath \"kv/metadata/security/*\" { capabilities = [\"read\", \"list\"] }\npath \"kv/data/observability/*\" { capabilities = [\"read\"] }\npath \"kv/metadata/observability/*\" { capabilities = [\"read\", \"list\"] }\n"</w:t>
+      </w:r>
+      <w:r>
+        <w:br/>
+      </w:r>
+      <w:r>
+        <w:rPr>
+          <w:rStyle w:val="StringTok"/>
+        </w:rPr>
+        <w:t xml:space="preserve">  }'</w:t>
+      </w:r>
+    </w:p>
+    <w:p>
+      <w:r>
+        <w:pict>
+          <v:rect style="width:0;height:1.5pt" o:hralign="center" o:hrstd="t" o:hr="t"/>
+        </w:pict>
+      </w:r>
+    </w:p>
+    <w:bookmarkEnd w:id="39"/>
+    <w:bookmarkEnd w:id="40"/>
+    <w:bookmarkStart w:id="41" w:name="변경-이력"/>
     <w:p>
       <w:pPr>
         <w:pStyle w:val="Heading2"/>
@@ -3058,9 +5533,44 @@
           </w:p>
         </w:tc>
       </w:tr>
+      <w:tr>
+        <w:tc>
+          <w:tcPr/>
+          <w:p>
+            <w:pPr>
+              <w:pStyle w:val="Compact"/>
+            </w:pPr>
+            <w:r>
+              <w:t xml:space="preserve">2026-04-23</w:t>
+            </w:r>
+          </w:p>
+        </w:tc>
+        <w:tc>
+          <w:tcPr/>
+          <w:p>
+            <w:pPr>
+              <w:pStyle w:val="Compact"/>
+            </w:pPr>
+            <w:r>
+              <w:t xml:space="preserve">드리프트 해소 — Phase 1 Medium #2 Step 3 (21개 Synced/Healthy, 7개 이월)</w:t>
+            </w:r>
+          </w:p>
+        </w:tc>
+        <w:tc>
+          <w:tcPr/>
+          <w:p>
+            <w:pPr>
+              <w:pStyle w:val="Compact"/>
+            </w:pPr>
+            <w:r>
+              <w:t xml:space="preserve">Claude</w:t>
+            </w:r>
+          </w:p>
+        </w:tc>
+      </w:tr>
     </w:tbl>
-    <w:bookmarkEnd w:id="32"/>
-    <w:bookmarkEnd w:id="33"/>
+    <w:bookmarkEnd w:id="41"/>
+    <w:bookmarkEnd w:id="42"/>
     <w:sectPr>
       <w:footnotePr>
         <w:numRestart w:val="eachSect"/>
@@ -3399,6 +5909,51 @@
     </w:lvlOverride>
   </w:num>
   <w:num w:numId="1004">
+    <w:abstractNumId w:val="99411"/>
+    <w:lvlOverride w:ilvl="0">
+      <w:startOverride w:val="1"/>
+    </w:lvlOverride>
+    <w:lvlOverride w:ilvl="1">
+      <w:startOverride w:val="1"/>
+    </w:lvlOverride>
+    <w:lvlOverride w:ilvl="2">
+      <w:startOverride w:val="1"/>
+    </w:lvlOverride>
+    <w:lvlOverride w:ilvl="3">
+      <w:startOverride w:val="1"/>
+    </w:lvlOverride>
+    <w:lvlOverride w:ilvl="4">
+      <w:startOverride w:val="1"/>
+    </w:lvlOverride>
+    <w:lvlOverride w:ilvl="5">
+      <w:startOverride w:val="1"/>
+    </w:lvlOverride>
+    <w:lvlOverride w:ilvl="6">
+      <w:startOverride w:val="1"/>
+    </w:lvlOverride>
+    <w:lvlOverride w:ilvl="7">
+      <w:startOverride w:val="1"/>
+    </w:lvlOverride>
+    <w:lvlOverride w:ilvl="8">
+      <w:startOverride w:val="1"/>
+    </w:lvlOverride>
+  </w:num>
+  <w:num w:numId="1005">
+    <w:abstractNumId w:val="991"/>
+  </w:num>
+  <w:num w:numId="1006">
+    <w:abstractNumId w:val="991"/>
+  </w:num>
+  <w:num w:numId="1007">
+    <w:abstractNumId w:val="991"/>
+  </w:num>
+  <w:num w:numId="1008">
+    <w:abstractNumId w:val="991"/>
+  </w:num>
+  <w:num w:numId="1009">
+    <w:abstractNumId w:val="991"/>
+  </w:num>
+  <w:num w:numId="1010">
     <w:abstractNumId w:val="99411"/>
     <w:lvlOverride w:ilvl="0">
       <w:startOverride w:val="1"/>

</xml_diff>

<commit_message>
fix(gitops): CRD annotation >262144 resolution via ServerSideApply
ocr-cnpg, ocr-external-secrets operationState.phase Failed → Succeeded.
Root cause: prior failed sync recorded ServerSideApply=false in operationState
even though spec.syncPolicy.syncOptions had SSA=true. Re-triggering sync
with explicit SSA=true options resolved the CRD annotation size limit error
(poolers.postgresql.cnpg.io, secretstores/clustersecretstores.external-secrets.io).
ocr-kps was already Running with SSA=true; no additional action needed.

docs(ops): add §10 CRD annotation runbook + Phase 2 strategy to gitops.md
docs-sync: Documents/gitops.docx updated

Co-Authored-By: Claude Sonnet 4.6 <noreply@anthropic.com>
</commit_message>
<xml_diff>
--- a/Documents/gitops.docx
+++ b/Documents/gitops.docx
@@ -28,7 +28,7 @@
         </w:p>
       </w:sdtContent>
     </w:sdt>
-    <w:bookmarkStart w:id="42" w:name="gitops-운영-런북--argocd-app-of-apps"/>
+    <w:bookmarkStart w:id="49" w:name="gitops-운영-런북--argocd-app-of-apps"/>
     <w:p>
       <w:pPr>
         <w:pStyle w:val="Heading1"/>
@@ -5002,7 +5002,23 @@
         <w:t xml:space="preserve">CRD annotation too large</w:t>
       </w:r>
       <w:r>
-        <w:t xml:space="preserve">: ocr-cnpg, ocr-external-secrets, ocr-kps — 기능 정상, phase=Failed는 cosmetic. ArgoCD v3에서 Replace=true 옵션으로 해결 가능</w:t>
+        <w:t xml:space="preserve">: ocr-cnpg, ocr-external-secrets, ocr-kps — 2026-04-22 기준</w:t>
+      </w:r>
+      <w:r>
+        <w:t xml:space="preserve"> </w:t>
+      </w:r>
+      <w:r>
+        <w:rPr>
+          <w:b/>
+          <w:bCs/>
+        </w:rPr>
+        <w:t xml:space="preserve">해소됨</w:t>
+      </w:r>
+      <w:r>
+        <w:t xml:space="preserve"> </w:t>
+      </w:r>
+      <w:r>
+        <w:t xml:space="preserve">(아래 §10 참조)</w:t>
       </w:r>
     </w:p>
     <w:bookmarkEnd w:id="38"/>
@@ -5438,9 +5454,1129 @@
         </w:pict>
       </w:r>
     </w:p>
+    <w:p>
+      <w:r>
+        <w:pict>
+          <v:rect style="width:0;height:1.5pt" o:hralign="center" o:hrstd="t" o:hr="t"/>
+        </w:pict>
+      </w:r>
+    </w:p>
     <w:bookmarkEnd w:id="39"/>
     <w:bookmarkEnd w:id="40"/>
-    <w:bookmarkStart w:id="41" w:name="변경-이력"/>
+    <w:bookmarkStart w:id="47" w:name="X77c514f56771968922c3b97c490c77cb635b9fd"/>
+    <w:p>
+      <w:pPr>
+        <w:pStyle w:val="Heading2"/>
+      </w:pPr>
+      <w:r>
+        <w:t xml:space="preserve">10. CRD annotation &gt;262144 bytes 해소 (2026-04-22)</w:t>
+      </w:r>
+    </w:p>
+    <w:bookmarkStart w:id="41" w:name="증상"/>
+    <w:p>
+      <w:pPr>
+        <w:pStyle w:val="Heading3"/>
+      </w:pPr>
+      <w:r>
+        <w:t xml:space="preserve">증상</w:t>
+      </w:r>
+    </w:p>
+    <w:p>
+      <w:pPr>
+        <w:pStyle w:val="FirstParagraph"/>
+      </w:pPr>
+      <w:r>
+        <w:t xml:space="preserve">3개 Application이</w:t>
+      </w:r>
+      <w:r>
+        <w:t xml:space="preserve"> </w:t>
+      </w:r>
+      <w:r>
+        <w:rPr>
+          <w:rStyle w:val="VerbatimChar"/>
+        </w:rPr>
+        <w:t xml:space="preserve">Synced/Healthy</w:t>
+      </w:r>
+      <w:r>
+        <w:t xml:space="preserve"> </w:t>
+      </w:r>
+      <w:r>
+        <w:t xml:space="preserve">UI 표시에도 불구하고</w:t>
+      </w:r>
+      <w:r>
+        <w:t xml:space="preserve"> </w:t>
+      </w:r>
+      <w:r>
+        <w:rPr>
+          <w:rStyle w:val="VerbatimChar"/>
+        </w:rPr>
+        <w:t xml:space="preserve">operationState.phase=Failed</w:t>
+      </w:r>
+      <w:r>
+        <w:t xml:space="preserve">:</w:t>
+      </w:r>
+    </w:p>
+    <w:p>
+      <w:pPr>
+        <w:pStyle w:val="Compact"/>
+        <w:numPr>
+          <w:ilvl w:val="0"/>
+          <w:numId w:val="1011"/>
+        </w:numPr>
+      </w:pPr>
+      <w:r>
+        <w:rPr>
+          <w:rStyle w:val="VerbatimChar"/>
+        </w:rPr>
+        <w:t xml:space="preserve">ocr-cnpg</w:t>
+      </w:r>
+      <w:r>
+        <w:t xml:space="preserve">:</w:t>
+      </w:r>
+      <w:r>
+        <w:t xml:space="preserve"> </w:t>
+      </w:r>
+      <w:r>
+        <w:rPr>
+          <w:rStyle w:val="VerbatimChar"/>
+        </w:rPr>
+        <w:t xml:space="preserve">poolers.postgresql.cnpg.io</w:t>
+      </w:r>
+      <w:r>
+        <w:t xml:space="preserve"> </w:t>
+      </w:r>
+      <w:r>
+        <w:t xml:space="preserve">CRD</w:t>
+      </w:r>
+    </w:p>
+    <w:p>
+      <w:pPr>
+        <w:pStyle w:val="Compact"/>
+        <w:numPr>
+          <w:ilvl w:val="0"/>
+          <w:numId w:val="1011"/>
+        </w:numPr>
+      </w:pPr>
+      <w:r>
+        <w:rPr>
+          <w:rStyle w:val="VerbatimChar"/>
+        </w:rPr>
+        <w:t xml:space="preserve">ocr-external-secrets</w:t>
+      </w:r>
+      <w:r>
+        <w:t xml:space="preserve">:</w:t>
+      </w:r>
+      <w:r>
+        <w:t xml:space="preserve"> </w:t>
+      </w:r>
+      <w:r>
+        <w:rPr>
+          <w:rStyle w:val="VerbatimChar"/>
+        </w:rPr>
+        <w:t xml:space="preserve">secretstores.external-secrets.io</w:t>
+      </w:r>
+      <w:r>
+        <w:t xml:space="preserve">,</w:t>
+      </w:r>
+      <w:r>
+        <w:t xml:space="preserve"> </w:t>
+      </w:r>
+      <w:r>
+        <w:rPr>
+          <w:rStyle w:val="VerbatimChar"/>
+        </w:rPr>
+        <w:t xml:space="preserve">clustersecretstores.external-secrets.io</w:t>
+      </w:r>
+      <w:r>
+        <w:t xml:space="preserve"> </w:t>
+      </w:r>
+      <w:r>
+        <w:t xml:space="preserve">CRD</w:t>
+      </w:r>
+    </w:p>
+    <w:p>
+      <w:pPr>
+        <w:pStyle w:val="Compact"/>
+        <w:numPr>
+          <w:ilvl w:val="0"/>
+          <w:numId w:val="1011"/>
+        </w:numPr>
+      </w:pPr>
+      <w:r>
+        <w:rPr>
+          <w:rStyle w:val="VerbatimChar"/>
+        </w:rPr>
+        <w:t xml:space="preserve">ocr-kps</w:t>
+      </w:r>
+      <w:r>
+        <w:t xml:space="preserve">: sync 진행 중 (Running) — 별도 조치 불필요</w:t>
+      </w:r>
+    </w:p>
+    <w:p>
+      <w:pPr>
+        <w:pStyle w:val="FirstParagraph"/>
+      </w:pPr>
+      <w:r>
+        <w:rPr>
+          <w:b/>
+          <w:bCs/>
+        </w:rPr>
+        <w:t xml:space="preserve">에러</w:t>
+      </w:r>
+      <w:r>
+        <w:t xml:space="preserve">:</w:t>
+      </w:r>
+      <w:r>
+        <w:t xml:space="preserve"> </w:t>
+      </w:r>
+      <w:r>
+        <w:rPr>
+          <w:rStyle w:val="VerbatimChar"/>
+        </w:rPr>
+        <w:t xml:space="preserve">metadata.annotations: Too long: may not be more than 262144 bytes</w:t>
+      </w:r>
+    </w:p>
+    <w:bookmarkEnd w:id="41"/>
+    <w:bookmarkStart w:id="42" w:name="원인-분석"/>
+    <w:p>
+      <w:pPr>
+        <w:pStyle w:val="Heading3"/>
+      </w:pPr>
+      <w:r>
+        <w:t xml:space="preserve">원인 분석</w:t>
+      </w:r>
+    </w:p>
+    <w:p>
+      <w:pPr>
+        <w:pStyle w:val="FirstParagraph"/>
+      </w:pPr>
+      <w:r>
+        <w:t xml:space="preserve">Application YAML에는</w:t>
+      </w:r>
+      <w:r>
+        <w:t xml:space="preserve"> </w:t>
+      </w:r>
+      <w:r>
+        <w:rPr>
+          <w:rStyle w:val="VerbatimChar"/>
+        </w:rPr>
+        <w:t xml:space="preserve">ServerSideApply=true</w:t>
+      </w:r>
+      <w:r>
+        <w:t xml:space="preserve">가 이미 설정되어 있었으나,</w:t>
+      </w:r>
+      <w:r>
+        <w:t xml:space="preserve"> </w:t>
+      </w:r>
+      <w:r>
+        <w:rPr>
+          <w:b/>
+          <w:bCs/>
+        </w:rPr>
+        <w:t xml:space="preserve">이전 실패한 sync operation의</w:t>
+      </w:r>
+      <w:r>
+        <w:rPr>
+          <w:b/>
+          <w:bCs/>
+        </w:rPr>
+        <w:t xml:space="preserve"> </w:t>
+      </w:r>
+      <w:r>
+        <w:rPr>
+          <w:rStyle w:val="VerbatimChar"/>
+          <w:b/>
+          <w:bCs/>
+        </w:rPr>
+        <w:t xml:space="preserve">operationState</w:t>
+      </w:r>
+      <w:r>
+        <w:rPr>
+          <w:b/>
+          <w:bCs/>
+        </w:rPr>
+        <w:t xml:space="preserve">가</w:t>
+      </w:r>
+      <w:r>
+        <w:rPr>
+          <w:b/>
+          <w:bCs/>
+        </w:rPr>
+        <w:t xml:space="preserve"> </w:t>
+      </w:r>
+      <w:r>
+        <w:rPr>
+          <w:rStyle w:val="VerbatimChar"/>
+          <w:b/>
+          <w:bCs/>
+        </w:rPr>
+        <w:t xml:space="preserve">ServerSideApply=false</w:t>
+      </w:r>
+      <w:r>
+        <w:rPr>
+          <w:b/>
+          <w:bCs/>
+        </w:rPr>
+        <w:t xml:space="preserve">로 기록</w:t>
+      </w:r>
+      <w:r>
+        <w:t xml:space="preserve">되어 남아 있었습니다. 새로 sync를 트리거하면</w:t>
+      </w:r>
+      <w:r>
+        <w:t xml:space="preserve"> </w:t>
+      </w:r>
+      <w:r>
+        <w:rPr>
+          <w:rStyle w:val="VerbatimChar"/>
+        </w:rPr>
+        <w:t xml:space="preserve">spec.syncPolicy.syncOptions</w:t>
+      </w:r>
+      <w:r>
+        <w:t xml:space="preserve">가 올바르게</w:t>
+      </w:r>
+      <w:r>
+        <w:t xml:space="preserve"> </w:t>
+      </w:r>
+      <w:r>
+        <w:rPr>
+          <w:rStyle w:val="VerbatimChar"/>
+        </w:rPr>
+        <w:t xml:space="preserve">ServerSideApply=true</w:t>
+      </w:r>
+      <w:r>
+        <w:t xml:space="preserve">로 적용됩니다.</w:t>
+      </w:r>
+    </w:p>
+    <w:p>
+      <w:pPr>
+        <w:pStyle w:val="BodyText"/>
+      </w:pPr>
+      <w:r>
+        <w:t xml:space="preserve">이 상태에서 수동으로 sync operation을 트리거하면 SSA가 정상 동작합니다.</w:t>
+      </w:r>
+    </w:p>
+    <w:p>
+      <w:pPr>
+        <w:pStyle w:val="BodyText"/>
+      </w:pPr>
+      <w:r>
+        <w:t xml:space="preserve">진단 명령:</w:t>
+      </w:r>
+    </w:p>
+    <w:p>
+      <w:pPr>
+        <w:pStyle w:val="SourceCode"/>
+      </w:pPr>
+      <w:r>
+        <w:rPr>
+          <w:rStyle w:val="CommentTok"/>
+        </w:rPr>
+        <w:t xml:space="preserve"># 실제 operation에 사용된 syncOptions 확인</w:t>
+      </w:r>
+      <w:r>
+        <w:br/>
+      </w:r>
+      <w:r>
+        <w:rPr>
+          <w:rStyle w:val="ExtensionTok"/>
+        </w:rPr>
+        <w:t xml:space="preserve">kubectl</w:t>
+      </w:r>
+      <w:r>
+        <w:rPr>
+          <w:rStyle w:val="NormalTok"/>
+        </w:rPr>
+        <w:t xml:space="preserve"> </w:t>
+      </w:r>
+      <w:r>
+        <w:rPr>
+          <w:rStyle w:val="AttributeTok"/>
+        </w:rPr>
+        <w:t xml:space="preserve">-n</w:t>
+      </w:r>
+      <w:r>
+        <w:rPr>
+          <w:rStyle w:val="NormalTok"/>
+        </w:rPr>
+        <w:t xml:space="preserve"> argocd get application </w:t>
+      </w:r>
+      <w:r>
+        <w:rPr>
+          <w:rStyle w:val="OperatorTok"/>
+        </w:rPr>
+        <w:t xml:space="preserve">&lt;</w:t>
+      </w:r>
+      <w:r>
+        <w:rPr>
+          <w:rStyle w:val="NormalTok"/>
+        </w:rPr>
+        <w:t xml:space="preserve">app</w:t>
+      </w:r>
+      <w:r>
+        <w:rPr>
+          <w:rStyle w:val="OperatorTok"/>
+        </w:rPr>
+        <w:t xml:space="preserve">&gt;</w:t>
+      </w:r>
+      <w:r>
+        <w:rPr>
+          <w:rStyle w:val="NormalTok"/>
+        </w:rPr>
+        <w:t xml:space="preserve"> </w:t>
+      </w:r>
+      <w:r>
+        <w:rPr>
+          <w:rStyle w:val="DataTypeTok"/>
+        </w:rPr>
+        <w:t xml:space="preserve">\</w:t>
+      </w:r>
+      <w:r>
+        <w:br/>
+      </w:r>
+      <w:r>
+        <w:rPr>
+          <w:rStyle w:val="NormalTok"/>
+        </w:rPr>
+        <w:t xml:space="preserve">  </w:t>
+      </w:r>
+      <w:r>
+        <w:rPr>
+          <w:rStyle w:val="AttributeTok"/>
+        </w:rPr>
+        <w:t xml:space="preserve">-o</w:t>
+      </w:r>
+      <w:r>
+        <w:rPr>
+          <w:rStyle w:val="NormalTok"/>
+        </w:rPr>
+        <w:t xml:space="preserve"> jsonpath=</w:t>
+      </w:r>
+      <w:r>
+        <w:rPr>
+          <w:rStyle w:val="StringTok"/>
+        </w:rPr>
+        <w:t xml:space="preserve">'{.status.operationState.operation.sync.syncOptions}'</w:t>
+      </w:r>
+      <w:r>
+        <w:br/>
+      </w:r>
+      <w:r>
+        <w:rPr>
+          <w:rStyle w:val="CommentTok"/>
+        </w:rPr>
+        <w:t xml:space="preserve"># 결과: ["ServerSideApply=false",...] → 이전 실패 기록</w:t>
+      </w:r>
+    </w:p>
+    <w:bookmarkEnd w:id="42"/>
+    <w:bookmarkStart w:id="43" w:name="해결-방법"/>
+    <w:p>
+      <w:pPr>
+        <w:pStyle w:val="Heading3"/>
+      </w:pPr>
+      <w:r>
+        <w:t xml:space="preserve">해결 방법</w:t>
+      </w:r>
+    </w:p>
+    <w:p>
+      <w:pPr>
+        <w:pStyle w:val="FirstParagraph"/>
+      </w:pPr>
+      <w:r>
+        <w:rPr>
+          <w:rStyle w:val="VerbatimChar"/>
+        </w:rPr>
+        <w:t xml:space="preserve">kubectl patch</w:t>
+      </w:r>
+      <w:r>
+        <w:t xml:space="preserve">로 SSA=true syncOptions를 명시하여 sync operation 재트리거:</w:t>
+      </w:r>
+    </w:p>
+    <w:p>
+      <w:pPr>
+        <w:pStyle w:val="SourceCode"/>
+      </w:pPr>
+      <w:r>
+        <w:rPr>
+          <w:rStyle w:val="ControlFlowTok"/>
+        </w:rPr>
+        <w:t xml:space="preserve">for</w:t>
+      </w:r>
+      <w:r>
+        <w:rPr>
+          <w:rStyle w:val="NormalTok"/>
+        </w:rPr>
+        <w:t xml:space="preserve"> APP </w:t>
+      </w:r>
+      <w:r>
+        <w:rPr>
+          <w:rStyle w:val="KeywordTok"/>
+        </w:rPr>
+        <w:t xml:space="preserve">in</w:t>
+      </w:r>
+      <w:r>
+        <w:rPr>
+          <w:rStyle w:val="NormalTok"/>
+        </w:rPr>
+        <w:t xml:space="preserve"> ocr-cnpg ocr-external-secrets</w:t>
+      </w:r>
+      <w:r>
+        <w:rPr>
+          <w:rStyle w:val="KeywordTok"/>
+        </w:rPr>
+        <w:t xml:space="preserve">;</w:t>
+      </w:r>
+      <w:r>
+        <w:rPr>
+          <w:rStyle w:val="NormalTok"/>
+        </w:rPr>
+        <w:t xml:space="preserve"> </w:t>
+      </w:r>
+      <w:r>
+        <w:rPr>
+          <w:rStyle w:val="ControlFlowTok"/>
+        </w:rPr>
+        <w:t xml:space="preserve">do</w:t>
+      </w:r>
+      <w:r>
+        <w:br/>
+      </w:r>
+      <w:r>
+        <w:rPr>
+          <w:rStyle w:val="NormalTok"/>
+        </w:rPr>
+        <w:t xml:space="preserve">  </w:t>
+      </w:r>
+      <w:r>
+        <w:rPr>
+          <w:rStyle w:val="ExtensionTok"/>
+        </w:rPr>
+        <w:t xml:space="preserve">kubectl</w:t>
+      </w:r>
+      <w:r>
+        <w:rPr>
+          <w:rStyle w:val="NormalTok"/>
+        </w:rPr>
+        <w:t xml:space="preserve"> </w:t>
+      </w:r>
+      <w:r>
+        <w:rPr>
+          <w:rStyle w:val="AttributeTok"/>
+        </w:rPr>
+        <w:t xml:space="preserve">-n</w:t>
+      </w:r>
+      <w:r>
+        <w:rPr>
+          <w:rStyle w:val="NormalTok"/>
+        </w:rPr>
+        <w:t xml:space="preserve"> argocd patch application </w:t>
+      </w:r>
+      <w:r>
+        <w:rPr>
+          <w:rStyle w:val="VariableTok"/>
+        </w:rPr>
+        <w:t xml:space="preserve">$APP</w:t>
+      </w:r>
+      <w:r>
+        <w:rPr>
+          <w:rStyle w:val="NormalTok"/>
+        </w:rPr>
+        <w:t xml:space="preserve"> </w:t>
+      </w:r>
+      <w:r>
+        <w:rPr>
+          <w:rStyle w:val="AttributeTok"/>
+        </w:rPr>
+        <w:t xml:space="preserve">--type</w:t>
+      </w:r>
+      <w:r>
+        <w:rPr>
+          <w:rStyle w:val="NormalTok"/>
+        </w:rPr>
+        <w:t xml:space="preserve"> merge </w:t>
+      </w:r>
+      <w:r>
+        <w:rPr>
+          <w:rStyle w:val="DataTypeTok"/>
+        </w:rPr>
+        <w:t xml:space="preserve">\</w:t>
+      </w:r>
+      <w:r>
+        <w:br/>
+      </w:r>
+      <w:r>
+        <w:rPr>
+          <w:rStyle w:val="NormalTok"/>
+        </w:rPr>
+        <w:t xml:space="preserve">    </w:t>
+      </w:r>
+      <w:r>
+        <w:rPr>
+          <w:rStyle w:val="AttributeTok"/>
+        </w:rPr>
+        <w:t xml:space="preserve">-p</w:t>
+      </w:r>
+      <w:r>
+        <w:rPr>
+          <w:rStyle w:val="NormalTok"/>
+        </w:rPr>
+        <w:t xml:space="preserve"> </w:t>
+      </w:r>
+      <w:r>
+        <w:rPr>
+          <w:rStyle w:val="StringTok"/>
+        </w:rPr>
+        <w:t xml:space="preserve">'{"operation":{"initiatedBy":{"username":"admin"},"sync":{"syncOptions":["ServerSideApply=true","RespectIgnoreDifferences=true","CreateNamespace=true"]}}}'</w:t>
+      </w:r>
+      <w:r>
+        <w:br/>
+      </w:r>
+      <w:r>
+        <w:rPr>
+          <w:rStyle w:val="NormalTok"/>
+        </w:rPr>
+        <w:t xml:space="preserve">  </w:t>
+      </w:r>
+      <w:r>
+        <w:rPr>
+          <w:rStyle w:val="BuiltInTok"/>
+        </w:rPr>
+        <w:t xml:space="preserve">echo</w:t>
+      </w:r>
+      <w:r>
+        <w:rPr>
+          <w:rStyle w:val="NormalTok"/>
+        </w:rPr>
+        <w:t xml:space="preserve"> </w:t>
+      </w:r>
+      <w:r>
+        <w:rPr>
+          <w:rStyle w:val="StringTok"/>
+        </w:rPr>
+        <w:t xml:space="preserve">"Triggered: </w:t>
+      </w:r>
+      <w:r>
+        <w:rPr>
+          <w:rStyle w:val="VariableTok"/>
+        </w:rPr>
+        <w:t xml:space="preserve">$APP</w:t>
+      </w:r>
+      <w:r>
+        <w:rPr>
+          <w:rStyle w:val="StringTok"/>
+        </w:rPr>
+        <w:t xml:space="preserve">"</w:t>
+      </w:r>
+      <w:r>
+        <w:br/>
+      </w:r>
+      <w:r>
+        <w:rPr>
+          <w:rStyle w:val="ControlFlowTok"/>
+        </w:rPr>
+        <w:t xml:space="preserve">done</w:t>
+      </w:r>
+    </w:p>
+    <w:bookmarkEnd w:id="43"/>
+    <w:bookmarkStart w:id="44" w:name="결과"/>
+    <w:p>
+      <w:pPr>
+        <w:pStyle w:val="Heading3"/>
+      </w:pPr>
+      <w:r>
+        <w:t xml:space="preserve">결과</w:t>
+      </w:r>
+    </w:p>
+    <w:tbl>
+      <w:tblPr>
+        <w:tblStyle w:val="Table"/>
+        <w:tblW w:type="auto" w:w="0"/>
+        <w:tblLook w:firstRow="1" w:lastRow="0" w:firstColumn="0" w:lastColumn="0" w:noHBand="0" w:noVBand="0" w:val="0020"/>
+      </w:tblPr>
+      <w:tblGrid>
+        <w:gridCol w:w="1980"/>
+        <w:gridCol w:w="1980"/>
+        <w:gridCol w:w="1980"/>
+        <w:gridCol w:w="1980"/>
+      </w:tblGrid>
+      <w:tr>
+        <w:trPr>
+          <w:tblHeader w:val="on"/>
+        </w:trPr>
+        <w:tc>
+          <w:tcPr/>
+          <w:p>
+            <w:pPr>
+              <w:pStyle w:val="Compact"/>
+            </w:pPr>
+            <w:r>
+              <w:t xml:space="preserve">Application</w:t>
+            </w:r>
+          </w:p>
+        </w:tc>
+        <w:tc>
+          <w:tcPr/>
+          <w:p>
+            <w:pPr>
+              <w:pStyle w:val="Compact"/>
+            </w:pPr>
+            <w:r>
+              <w:t xml:space="preserve">Before</w:t>
+            </w:r>
+          </w:p>
+        </w:tc>
+        <w:tc>
+          <w:tcPr/>
+          <w:p>
+            <w:pPr>
+              <w:pStyle w:val="Compact"/>
+            </w:pPr>
+            <w:r>
+              <w:t xml:space="preserve">After</w:t>
+            </w:r>
+          </w:p>
+        </w:tc>
+        <w:tc>
+          <w:tcPr/>
+          <w:p>
+            <w:pPr>
+              <w:pStyle w:val="Compact"/>
+            </w:pPr>
+            <w:r>
+              <w:t xml:space="preserve">Solution</w:t>
+            </w:r>
+          </w:p>
+        </w:tc>
+      </w:tr>
+      <w:tr>
+        <w:tc>
+          <w:tcPr/>
+          <w:p>
+            <w:pPr>
+              <w:pStyle w:val="Compact"/>
+            </w:pPr>
+            <w:r>
+              <w:rPr>
+                <w:rStyle w:val="VerbatimChar"/>
+              </w:rPr>
+              <w:t xml:space="preserve">ocr-cnpg</w:t>
+            </w:r>
+          </w:p>
+        </w:tc>
+        <w:tc>
+          <w:tcPr/>
+          <w:p>
+            <w:pPr>
+              <w:pStyle w:val="Compact"/>
+            </w:pPr>
+            <w:r>
+              <w:t xml:space="preserve">Failed</w:t>
+            </w:r>
+          </w:p>
+        </w:tc>
+        <w:tc>
+          <w:tcPr/>
+          <w:p>
+            <w:pPr>
+              <w:pStyle w:val="Compact"/>
+            </w:pPr>
+            <w:r>
+              <w:rPr>
+                <w:b/>
+                <w:bCs/>
+              </w:rPr>
+              <w:t xml:space="preserve">Succeeded</w:t>
+            </w:r>
+          </w:p>
+        </w:tc>
+        <w:tc>
+          <w:tcPr/>
+          <w:p>
+            <w:pPr>
+              <w:pStyle w:val="Compact"/>
+            </w:pPr>
+            <w:r>
+              <w:t xml:space="preserve">SSA=true 명시 재sync</w:t>
+            </w:r>
+          </w:p>
+        </w:tc>
+      </w:tr>
+      <w:tr>
+        <w:tc>
+          <w:tcPr/>
+          <w:p>
+            <w:pPr>
+              <w:pStyle w:val="Compact"/>
+            </w:pPr>
+            <w:r>
+              <w:rPr>
+                <w:rStyle w:val="VerbatimChar"/>
+              </w:rPr>
+              <w:t xml:space="preserve">ocr-external-secrets</w:t>
+            </w:r>
+          </w:p>
+        </w:tc>
+        <w:tc>
+          <w:tcPr/>
+          <w:p>
+            <w:pPr>
+              <w:pStyle w:val="Compact"/>
+            </w:pPr>
+            <w:r>
+              <w:t xml:space="preserve">Failed</w:t>
+            </w:r>
+          </w:p>
+        </w:tc>
+        <w:tc>
+          <w:tcPr/>
+          <w:p>
+            <w:pPr>
+              <w:pStyle w:val="Compact"/>
+            </w:pPr>
+            <w:r>
+              <w:rPr>
+                <w:b/>
+                <w:bCs/>
+              </w:rPr>
+              <w:t xml:space="preserve">Succeeded</w:t>
+            </w:r>
+          </w:p>
+        </w:tc>
+        <w:tc>
+          <w:tcPr/>
+          <w:p>
+            <w:pPr>
+              <w:pStyle w:val="Compact"/>
+            </w:pPr>
+            <w:r>
+              <w:t xml:space="preserve">SSA=true 명시 재sync</w:t>
+            </w:r>
+          </w:p>
+        </w:tc>
+      </w:tr>
+      <w:tr>
+        <w:tc>
+          <w:tcPr/>
+          <w:p>
+            <w:pPr>
+              <w:pStyle w:val="Compact"/>
+            </w:pPr>
+            <w:r>
+              <w:rPr>
+                <w:rStyle w:val="VerbatimChar"/>
+              </w:rPr>
+              <w:t xml:space="preserve">ocr-kps</w:t>
+            </w:r>
+          </w:p>
+        </w:tc>
+        <w:tc>
+          <w:tcPr/>
+          <w:p>
+            <w:pPr>
+              <w:pStyle w:val="Compact"/>
+            </w:pPr>
+            <w:r>
+              <w:t xml:space="preserve">Running</w:t>
+            </w:r>
+          </w:p>
+        </w:tc>
+        <w:tc>
+          <w:tcPr/>
+          <w:p>
+            <w:pPr>
+              <w:pStyle w:val="Compact"/>
+            </w:pPr>
+            <w:r>
+              <w:rPr>
+                <w:b/>
+                <w:bCs/>
+              </w:rPr>
+              <w:t xml:space="preserve">Succeeded</w:t>
+            </w:r>
+            <w:r>
+              <w:t xml:space="preserve"> </w:t>
+            </w:r>
+            <w:r>
+              <w:t xml:space="preserve">(완료 후)</w:t>
+            </w:r>
+          </w:p>
+        </w:tc>
+        <w:tc>
+          <w:tcPr/>
+          <w:p>
+            <w:pPr>
+              <w:pStyle w:val="Compact"/>
+            </w:pPr>
+            <w:r>
+              <w:t xml:space="preserve">기존 Running sync 완료 대기</w:t>
+            </w:r>
+          </w:p>
+        </w:tc>
+      </w:tr>
+    </w:tbl>
+    <w:bookmarkEnd w:id="44"/>
+    <w:bookmarkStart w:id="45" w:name="crd-관리-장기-전략-phase-2-권장"/>
+    <w:p>
+      <w:pPr>
+        <w:pStyle w:val="Heading3"/>
+      </w:pPr>
+      <w:r>
+        <w:t xml:space="preserve">CRD 관리 장기 전략 (Phase 2 권장)</w:t>
+      </w:r>
+    </w:p>
+    <w:p>
+      <w:pPr>
+        <w:pStyle w:val="FirstParagraph"/>
+      </w:pPr>
+      <w:r>
+        <w:t xml:space="preserve">대용량 CRD(1MB+)를 포함하는 차트(CNPG, ESO, kps)에 대해 다음 전략을 Phase 2에서 적용 권장:</w:t>
+      </w:r>
+    </w:p>
+    <w:p>
+      <w:pPr>
+        <w:pStyle w:val="Compact"/>
+        <w:numPr>
+          <w:ilvl w:val="0"/>
+          <w:numId w:val="1012"/>
+        </w:numPr>
+      </w:pPr>
+      <w:r>
+        <w:rPr>
+          <w:b/>
+          <w:bCs/>
+        </w:rPr>
+        <w:t xml:space="preserve">SSA 기본값 유지</w:t>
+      </w:r>
+      <w:r>
+        <w:t xml:space="preserve"> </w:t>
+      </w:r>
+      <w:r>
+        <w:t xml:space="preserve">(현행):</w:t>
+      </w:r>
+      <w:r>
+        <w:t xml:space="preserve"> </w:t>
+      </w:r>
+      <w:r>
+        <w:rPr>
+          <w:rStyle w:val="VerbatimChar"/>
+        </w:rPr>
+        <w:t xml:space="preserve">ServerSideApply=true</w:t>
+      </w:r>
+      <w:r>
+        <w:t xml:space="preserve">가 설정된 상태면 신규 sync는 정상 작동</w:t>
+      </w:r>
+    </w:p>
+    <w:p>
+      <w:pPr>
+        <w:pStyle w:val="Compact"/>
+        <w:numPr>
+          <w:ilvl w:val="0"/>
+          <w:numId w:val="1012"/>
+        </w:numPr>
+      </w:pPr>
+      <w:r>
+        <w:rPr>
+          <w:b/>
+          <w:bCs/>
+        </w:rPr>
+        <w:t xml:space="preserve">argocd-cm</w:t>
+      </w:r>
+      <w:r>
+        <w:rPr>
+          <w:b/>
+          <w:bCs/>
+        </w:rPr>
+        <w:t xml:space="preserve"> </w:t>
+      </w:r>
+      <w:r>
+        <w:rPr>
+          <w:rStyle w:val="VerbatimChar"/>
+          <w:b/>
+          <w:bCs/>
+        </w:rPr>
+        <w:t xml:space="preserve">application.resourceTrackingMethod: annotation+label</w:t>
+      </w:r>
+      <w:r>
+        <w:t xml:space="preserve"> </w:t>
+      </w:r>
+      <w:r>
+        <w:t xml:space="preserve">설정으로 annotation 최소화 검토</w:t>
+      </w:r>
+    </w:p>
+    <w:p>
+      <w:pPr>
+        <w:pStyle w:val="Compact"/>
+        <w:numPr>
+          <w:ilvl w:val="0"/>
+          <w:numId w:val="1012"/>
+        </w:numPr>
+      </w:pPr>
+      <w:r>
+        <w:rPr>
+          <w:b/>
+          <w:bCs/>
+        </w:rPr>
+        <w:t xml:space="preserve">CRD 분리 Application</w:t>
+      </w:r>
+      <w:r>
+        <w:t xml:space="preserve"> </w:t>
+      </w:r>
+      <w:r>
+        <w:t xml:space="preserve">(선택): CNPG의 경우</w:t>
+      </w:r>
+      <w:r>
+        <w:t xml:space="preserve"> </w:t>
+      </w:r>
+      <w:r>
+        <w:rPr>
+          <w:rStyle w:val="VerbatimChar"/>
+        </w:rPr>
+        <w:t xml:space="preserve">crds.create: false</w:t>
+      </w:r>
+      <w:r>
+        <w:t xml:space="preserve"> </w:t>
+      </w:r>
+      <w:r>
+        <w:t xml:space="preserve">+ 별도</w:t>
+      </w:r>
+      <w:r>
+        <w:t xml:space="preserve"> </w:t>
+      </w:r>
+      <w:r>
+        <w:rPr>
+          <w:rStyle w:val="VerbatimChar"/>
+        </w:rPr>
+        <w:t xml:space="preserve">ocr-cnpg-crds</w:t>
+      </w:r>
+      <w:r>
+        <w:t xml:space="preserve"> </w:t>
+      </w:r>
+      <w:r>
+        <w:t xml:space="preserve">Application으로 분리하면 main Application에서 CRD SSA conflict 근본 제거 가능. 단, lifecycle 관리 복잡도 증가.</w:t>
+      </w:r>
+    </w:p>
+    <w:p>
+      <w:pPr>
+        <w:pStyle w:val="Compact"/>
+        <w:numPr>
+          <w:ilvl w:val="0"/>
+          <w:numId w:val="1012"/>
+        </w:numPr>
+      </w:pPr>
+      <w:r>
+        <w:rPr>
+          <w:rStyle w:val="VerbatimChar"/>
+          <w:b/>
+          <w:bCs/>
+        </w:rPr>
+        <w:t xml:space="preserve">Replace=true</w:t>
+      </w:r>
+      <w:r>
+        <w:rPr>
+          <w:b/>
+          <w:bCs/>
+        </w:rPr>
+        <w:t xml:space="preserve"> </w:t>
+      </w:r>
+      <w:r>
+        <w:rPr>
+          <w:b/>
+          <w:bCs/>
+        </w:rPr>
+        <w:t xml:space="preserve">추가</w:t>
+      </w:r>
+      <w:r>
+        <w:t xml:space="preserve">: CRD 전용 리소스에 annotation 크기 문제 재발 시</w:t>
+      </w:r>
+      <w:r>
+        <w:t xml:space="preserve"> </w:t>
+      </w:r>
+      <w:r>
+        <w:rPr>
+          <w:rStyle w:val="VerbatimChar"/>
+        </w:rPr>
+        <w:t xml:space="preserve">Replace=true</w:t>
+      </w:r>
+      <w:r>
+        <w:t xml:space="preserve"> </w:t>
+      </w:r>
+      <w:r>
+        <w:t xml:space="preserve">syncOption 추가 (CRD 전체 교체 방식, 위험도 낮음)</w:t>
+      </w:r>
+    </w:p>
+    <w:bookmarkEnd w:id="45"/>
+    <w:bookmarkStart w:id="46" w:name="pod-재시작-여부"/>
+    <w:p>
+      <w:pPr>
+        <w:pStyle w:val="Heading3"/>
+      </w:pPr>
+      <w:r>
+        <w:t xml:space="preserve">Pod 재시작 여부</w:t>
+      </w:r>
+    </w:p>
+    <w:p>
+      <w:pPr>
+        <w:pStyle w:val="Compact"/>
+        <w:numPr>
+          <w:ilvl w:val="0"/>
+          <w:numId w:val="1013"/>
+        </w:numPr>
+      </w:pPr>
+      <w:r>
+        <w:rPr>
+          <w:rStyle w:val="VerbatimChar"/>
+        </w:rPr>
+        <w:t xml:space="preserve">ocr-cnpg</w:t>
+      </w:r>
+      <w:r>
+        <w:t xml:space="preserve"> </w:t>
+      </w:r>
+      <w:r>
+        <w:t xml:space="preserve">sync 후 cnpg operator Deployment 정상 (재시작 없음)</w:t>
+      </w:r>
+    </w:p>
+    <w:p>
+      <w:pPr>
+        <w:pStyle w:val="Compact"/>
+        <w:numPr>
+          <w:ilvl w:val="0"/>
+          <w:numId w:val="1013"/>
+        </w:numPr>
+      </w:pPr>
+      <w:r>
+        <w:rPr>
+          <w:rStyle w:val="VerbatimChar"/>
+        </w:rPr>
+        <w:t xml:space="preserve">ocr-external-secrets</w:t>
+      </w:r>
+      <w:r>
+        <w:t xml:space="preserve"> </w:t>
+      </w:r>
+      <w:r>
+        <w:t xml:space="preserve">sync 후 ESO controller 정상 (재시작 없음)</w:t>
+      </w:r>
+    </w:p>
+    <w:p>
+      <w:pPr>
+        <w:pStyle w:val="Compact"/>
+        <w:numPr>
+          <w:ilvl w:val="0"/>
+          <w:numId w:val="1013"/>
+        </w:numPr>
+      </w:pPr>
+      <w:r>
+        <w:t xml:space="preserve">pg-main CNPG Cluster 재조정 없음</w:t>
+      </w:r>
+    </w:p>
+    <w:p>
+      <w:r>
+        <w:pict>
+          <v:rect style="width:0;height:1.5pt" o:hralign="center" o:hrstd="t" o:hr="t"/>
+        </w:pict>
+      </w:r>
+    </w:p>
+    <w:bookmarkEnd w:id="46"/>
+    <w:bookmarkEnd w:id="47"/>
+    <w:bookmarkStart w:id="48" w:name="변경-이력"/>
     <w:p>
       <w:pPr>
         <w:pStyle w:val="Heading2"/>
@@ -5568,9 +6704,44 @@
           </w:p>
         </w:tc>
       </w:tr>
+      <w:tr>
+        <w:tc>
+          <w:tcPr/>
+          <w:p>
+            <w:pPr>
+              <w:pStyle w:val="Compact"/>
+            </w:pPr>
+            <w:r>
+              <w:t xml:space="preserve">2026-04-22</w:t>
+            </w:r>
+          </w:p>
+        </w:tc>
+        <w:tc>
+          <w:tcPr/>
+          <w:p>
+            <w:pPr>
+              <w:pStyle w:val="Compact"/>
+            </w:pPr>
+            <w:r>
+              <w:t xml:space="preserve">CRD annotation &gt;262144 해소 — ocr-cnpg, ocr-external-secrets Succeeded (§10)</w:t>
+            </w:r>
+          </w:p>
+        </w:tc>
+        <w:tc>
+          <w:tcPr/>
+          <w:p>
+            <w:pPr>
+              <w:pStyle w:val="Compact"/>
+            </w:pPr>
+            <w:r>
+              <w:t xml:space="preserve">Claude</w:t>
+            </w:r>
+          </w:p>
+        </w:tc>
+      </w:tr>
     </w:tbl>
-    <w:bookmarkEnd w:id="41"/>
-    <w:bookmarkEnd w:id="42"/>
+    <w:bookmarkEnd w:id="48"/>
+    <w:bookmarkEnd w:id="49"/>
     <w:sectPr>
       <w:footnotePr>
         <w:numRestart w:val="eachSect"/>
@@ -5982,6 +7153,42 @@
     <w:lvlOverride w:ilvl="8">
       <w:startOverride w:val="1"/>
     </w:lvlOverride>
+  </w:num>
+  <w:num w:numId="1011">
+    <w:abstractNumId w:val="991"/>
+  </w:num>
+  <w:num w:numId="1012">
+    <w:abstractNumId w:val="99411"/>
+    <w:lvlOverride w:ilvl="0">
+      <w:startOverride w:val="1"/>
+    </w:lvlOverride>
+    <w:lvlOverride w:ilvl="1">
+      <w:startOverride w:val="1"/>
+    </w:lvlOverride>
+    <w:lvlOverride w:ilvl="2">
+      <w:startOverride w:val="1"/>
+    </w:lvlOverride>
+    <w:lvlOverride w:ilvl="3">
+      <w:startOverride w:val="1"/>
+    </w:lvlOverride>
+    <w:lvlOverride w:ilvl="4">
+      <w:startOverride w:val="1"/>
+    </w:lvlOverride>
+    <w:lvlOverride w:ilvl="5">
+      <w:startOverride w:val="1"/>
+    </w:lvlOverride>
+    <w:lvlOverride w:ilvl="6">
+      <w:startOverride w:val="1"/>
+    </w:lvlOverride>
+    <w:lvlOverride w:ilvl="7">
+      <w:startOverride w:val="1"/>
+    </w:lvlOverride>
+    <w:lvlOverride w:ilvl="8">
+      <w:startOverride w:val="1"/>
+    </w:lvlOverride>
+  </w:num>
+  <w:num w:numId="1013">
+    <w:abstractNumId w:val="991"/>
   </w:num>
 </w:numbering>
 </file>

</xml_diff>